<commit_message>
Sync local workspace updates
</commit_message>
<xml_diff>
--- a/Docs/20048736_Subanta_Poudel_CU6051NP.docx
+++ b/Docs/20048736_Subanta_Poudel_CU6051NP.docx
@@ -250,7 +250,7 @@
               <w:b/>
               <w:bCs/>
             </w:rPr>
-            <w:t>25%</w:t>
+            <w:t>75%</w:t>
           </w:r>
         </w:sdtContent>
       </w:sdt>
@@ -297,7 +297,7 @@
             <w:rPr>
               <w:b/>
             </w:rPr>
-            <w:t>Proposal</w:t>
+            <w:t>Final Submission</w:t>
           </w:r>
         </w:sdtContent>
       </w:sdt>
@@ -314,7 +314,13 @@
         <w:rPr>
           <w:b/>
         </w:rPr>
-        <w:t>Academic Semester: Autumn Semester 2025</w:t>
+        <w:t>Academic Semester: 2025</w:t>
+      </w:r>
+      <w:r>
+        <w:rPr>
+          <w:b/>
+        </w:rPr>
+        <w:t xml:space="preserve"> - 2026</w:t>
       </w:r>
     </w:p>
     <w:p>
@@ -427,7 +433,7 @@
           <w:placeholder>
             <w:docPart w:val="DefaultPlaceholder_-1854013437"/>
           </w:placeholder>
-          <w:date w:fullDate="2025-12-17T00:00:00Z">
+          <w:date w:fullDate="2026-07-31T00:00:00Z">
             <w:dateFormat w:val="dd/MM/yyyy"/>
             <w:lid w:val="en-GB"/>
             <w:storeMappedDataAs w:val="dateTime"/>
@@ -439,7 +445,7 @@
             <w:rPr>
               <w:color w:val="808080"/>
             </w:rPr>
-            <w:t>17/12/2025</w:t>
+            <w:t>31/07/2026</w:t>
           </w:r>
         </w:sdtContent>
       </w:sdt>
@@ -467,7 +473,7 @@
           <w:placeholder>
             <w:docPart w:val="BC943E213F144C4E9A4112FB894647DB"/>
           </w:placeholder>
-          <w:date w:fullDate="2025-12-17T00:00:00Z">
+          <w:date w:fullDate="2026-07-29T00:00:00Z">
             <w:dateFormat w:val="dd/MM/yyyy"/>
             <w:lid w:val="en-GB"/>
             <w:storeMappedDataAs w:val="dateTime"/>
@@ -479,7 +485,7 @@
             <w:rPr>
               <w:b/>
             </w:rPr>
-            <w:t>17/12/2025</w:t>
+            <w:t>29/07/2026</w:t>
           </w:r>
         </w:sdtContent>
       </w:sdt>
@@ -521,7 +527,7 @@
             <w:rPr>
               <w:color w:val="A6A6A6" w:themeColor="background1" w:themeShade="A6"/>
             </w:rPr>
-            <w:t>Niroj Bahadur Karki</w:t>
+            <w:t>Jeevan Prakash Pant</w:t>
           </w:r>
         </w:sdtContent>
       </w:sdt>
@@ -722,7 +728,6 @@
           <w:pPr>
             <w:pStyle w:val="TOC1"/>
             <w:tabs>
-              <w:tab w:val="left" w:pos="480"/>
               <w:tab w:val="right" w:leader="dot" w:pos="9350"/>
             </w:tabs>
             <w:rPr>
@@ -742,7 +747,80 @@
           <w:r>
             <w:fldChar w:fldCharType="separate"/>
           </w:r>
-          <w:hyperlink w:anchor="_Toc216889932" w:history="1">
+          <w:hyperlink w:anchor="_Toc219895135" w:history="1">
+            <w:r>
+              <w:rPr>
+                <w:rStyle w:val="Hyperlink"/>
+                <w:noProof/>
+              </w:rPr>
+              <w:t>Table of Tables</w:t>
+            </w:r>
+            <w:r>
+              <w:rPr>
+                <w:noProof/>
+                <w:webHidden/>
+              </w:rPr>
+              <w:tab/>
+            </w:r>
+            <w:r>
+              <w:rPr>
+                <w:noProof/>
+                <w:webHidden/>
+              </w:rPr>
+              <w:fldChar w:fldCharType="begin"/>
+            </w:r>
+            <w:r>
+              <w:rPr>
+                <w:noProof/>
+                <w:webHidden/>
+              </w:rPr>
+              <w:instrText xml:space="preserve"> PAGEREF _Toc219895135 \h </w:instrText>
+            </w:r>
+            <w:r>
+              <w:rPr>
+                <w:noProof/>
+                <w:webHidden/>
+              </w:rPr>
+            </w:r>
+            <w:r>
+              <w:rPr>
+                <w:noProof/>
+                <w:webHidden/>
+              </w:rPr>
+              <w:fldChar w:fldCharType="separate"/>
+            </w:r>
+            <w:r>
+              <w:rPr>
+                <w:noProof/>
+                <w:webHidden/>
+              </w:rPr>
+              <w:t>3</w:t>
+            </w:r>
+            <w:r>
+              <w:rPr>
+                <w:noProof/>
+                <w:webHidden/>
+              </w:rPr>
+              <w:fldChar w:fldCharType="end"/>
+            </w:r>
+          </w:hyperlink>
+        </w:p>
+        <w:p>
+          <w:pPr>
+            <w:pStyle w:val="TOC1"/>
+            <w:tabs>
+              <w:tab w:val="left" w:pos="480"/>
+              <w:tab w:val="right" w:leader="dot" w:pos="9350"/>
+            </w:tabs>
+            <w:rPr>
+              <w:rFonts w:asciiTheme="minorHAnsi" w:eastAsiaTheme="minorEastAsia" w:hAnsiTheme="minorHAnsi" w:cstheme="minorBidi"/>
+              <w:noProof/>
+              <w:kern w:val="2"/>
+              <w:lang w:val="en-US" w:eastAsia="en-US"/>
+              <w14:ligatures w14:val="standardContextual"/>
+            </w:rPr>
+          </w:pPr>
+          <w:hyperlink w:anchor="_Toc219895136" w:history="1">
             <w:r>
               <w:rPr>
                 <w:rStyle w:val="Hyperlink"/>
@@ -786,7 +864,7 @@
                 <w:noProof/>
                 <w:webHidden/>
               </w:rPr>
-              <w:instrText xml:space="preserve"> PAGEREF _Toc216889932 \h </w:instrText>
+              <w:instrText xml:space="preserve"> PAGEREF _Toc219895136 \h </w:instrText>
             </w:r>
             <w:r>
               <w:rPr>
@@ -806,7 +884,7 @@
                 <w:noProof/>
                 <w:webHidden/>
               </w:rPr>
-              <w:t>3</w:t>
+              <w:t>4</w:t>
             </w:r>
             <w:r>
               <w:rPr>
@@ -832,7 +910,7 @@
               <w14:ligatures w14:val="standardContextual"/>
             </w:rPr>
           </w:pPr>
-          <w:hyperlink w:anchor="_Toc216889933" w:history="1">
+          <w:hyperlink w:anchor="_Toc219895137" w:history="1">
             <w:r>
               <w:rPr>
                 <w:rStyle w:val="Hyperlink"/>
@@ -876,7 +954,7 @@
                 <w:noProof/>
                 <w:webHidden/>
               </w:rPr>
-              <w:instrText xml:space="preserve"> PAGEREF _Toc216889933 \h </w:instrText>
+              <w:instrText xml:space="preserve"> PAGEREF _Toc219895137 \h </w:instrText>
             </w:r>
             <w:r>
               <w:rPr>
@@ -896,7 +974,7 @@
                 <w:noProof/>
                 <w:webHidden/>
               </w:rPr>
-              <w:t>3</w:t>
+              <w:t>4</w:t>
             </w:r>
             <w:r>
               <w:rPr>
@@ -922,7 +1000,7 @@
               <w14:ligatures w14:val="standardContextual"/>
             </w:rPr>
           </w:pPr>
-          <w:hyperlink w:anchor="_Toc216889934" w:history="1">
+          <w:hyperlink w:anchor="_Toc219895138" w:history="1">
             <w:r>
               <w:rPr>
                 <w:rStyle w:val="Hyperlink"/>
@@ -966,7 +1044,7 @@
                 <w:noProof/>
                 <w:webHidden/>
               </w:rPr>
-              <w:instrText xml:space="preserve"> PAGEREF _Toc216889934 \h </w:instrText>
+              <w:instrText xml:space="preserve"> PAGEREF _Toc219895138 \h </w:instrText>
             </w:r>
             <w:r>
               <w:rPr>
@@ -986,7 +1064,7 @@
                 <w:noProof/>
                 <w:webHidden/>
               </w:rPr>
-              <w:t>3</w:t>
+              <w:t>4</w:t>
             </w:r>
             <w:r>
               <w:rPr>
@@ -1012,7 +1090,7 @@
               <w14:ligatures w14:val="standardContextual"/>
             </w:rPr>
           </w:pPr>
-          <w:hyperlink w:anchor="_Toc216889935" w:history="1">
+          <w:hyperlink w:anchor="_Toc219895139" w:history="1">
             <w:r>
               <w:rPr>
                 <w:rStyle w:val="Hyperlink"/>
@@ -1056,7 +1134,7 @@
                 <w:noProof/>
                 <w:webHidden/>
               </w:rPr>
-              <w:instrText xml:space="preserve"> PAGEREF _Toc216889935 \h </w:instrText>
+              <w:instrText xml:space="preserve"> PAGEREF _Toc219895139 \h </w:instrText>
             </w:r>
             <w:r>
               <w:rPr>
@@ -1076,7 +1154,7 @@
                 <w:noProof/>
                 <w:webHidden/>
               </w:rPr>
-              <w:t>3</w:t>
+              <w:t>4</w:t>
             </w:r>
             <w:r>
               <w:rPr>
@@ -1102,7 +1180,7 @@
               <w14:ligatures w14:val="standardContextual"/>
             </w:rPr>
           </w:pPr>
-          <w:hyperlink w:anchor="_Toc216889936" w:history="1">
+          <w:hyperlink w:anchor="_Toc219895140" w:history="1">
             <w:r>
               <w:rPr>
                 <w:rStyle w:val="Hyperlink"/>
@@ -1146,7 +1224,7 @@
                 <w:noProof/>
                 <w:webHidden/>
               </w:rPr>
-              <w:instrText xml:space="preserve"> PAGEREF _Toc216889936 \h </w:instrText>
+              <w:instrText xml:space="preserve"> PAGEREF _Toc219895140 \h </w:instrText>
             </w:r>
             <w:r>
               <w:rPr>
@@ -1166,7 +1244,7 @@
                 <w:noProof/>
                 <w:webHidden/>
               </w:rPr>
-              <w:t>5</w:t>
+              <w:t>6</w:t>
             </w:r>
             <w:r>
               <w:rPr>
@@ -1192,7 +1270,7 @@
               <w14:ligatures w14:val="standardContextual"/>
             </w:rPr>
           </w:pPr>
-          <w:hyperlink w:anchor="_Toc216889937" w:history="1">
+          <w:hyperlink w:anchor="_Toc219895141" w:history="1">
             <w:r>
               <w:rPr>
                 <w:rStyle w:val="Hyperlink"/>
@@ -1236,7 +1314,7 @@
                 <w:noProof/>
                 <w:webHidden/>
               </w:rPr>
-              <w:instrText xml:space="preserve"> PAGEREF _Toc216889937 \h </w:instrText>
+              <w:instrText xml:space="preserve"> PAGEREF _Toc219895141 \h </w:instrText>
             </w:r>
             <w:r>
               <w:rPr>
@@ -1256,7 +1334,7 @@
                 <w:noProof/>
                 <w:webHidden/>
               </w:rPr>
-              <w:t>5</w:t>
+              <w:t>6</w:t>
             </w:r>
             <w:r>
               <w:rPr>
@@ -1282,7 +1360,7 @@
               <w14:ligatures w14:val="standardContextual"/>
             </w:rPr>
           </w:pPr>
-          <w:hyperlink w:anchor="_Toc216889938" w:history="1">
+          <w:hyperlink w:anchor="_Toc219895142" w:history="1">
             <w:r>
               <w:rPr>
                 <w:rStyle w:val="Hyperlink"/>
@@ -1326,7 +1404,7 @@
                 <w:noProof/>
                 <w:webHidden/>
               </w:rPr>
-              <w:instrText xml:space="preserve"> PAGEREF _Toc216889938 \h </w:instrText>
+              <w:instrText xml:space="preserve"> PAGEREF _Toc219895142 \h </w:instrText>
             </w:r>
             <w:r>
               <w:rPr>
@@ -1346,7 +1424,7 @@
                 <w:noProof/>
                 <w:webHidden/>
               </w:rPr>
-              <w:t>5</w:t>
+              <w:t>6</w:t>
             </w:r>
             <w:r>
               <w:rPr>
@@ -1372,7 +1450,7 @@
               <w14:ligatures w14:val="standardContextual"/>
             </w:rPr>
           </w:pPr>
-          <w:hyperlink w:anchor="_Toc216889939" w:history="1">
+          <w:hyperlink w:anchor="_Toc219895143" w:history="1">
             <w:r>
               <w:rPr>
                 <w:rStyle w:val="Hyperlink"/>
@@ -1416,7 +1494,7 @@
                 <w:noProof/>
                 <w:webHidden/>
               </w:rPr>
-              <w:instrText xml:space="preserve"> PAGEREF _Toc216889939 \h </w:instrText>
+              <w:instrText xml:space="preserve"> PAGEREF _Toc219895143 \h </w:instrText>
             </w:r>
             <w:r>
               <w:rPr>
@@ -1436,7 +1514,7 @@
                 <w:noProof/>
                 <w:webHidden/>
               </w:rPr>
-              <w:t>5</w:t>
+              <w:t>6</w:t>
             </w:r>
             <w:r>
               <w:rPr>
@@ -1462,7 +1540,7 @@
               <w14:ligatures w14:val="standardContextual"/>
             </w:rPr>
           </w:pPr>
-          <w:hyperlink w:anchor="_Toc216889940" w:history="1">
+          <w:hyperlink w:anchor="_Toc219895144" w:history="1">
             <w:r>
               <w:rPr>
                 <w:rStyle w:val="Hyperlink"/>
@@ -1506,7 +1584,7 @@
                 <w:noProof/>
                 <w:webHidden/>
               </w:rPr>
-              <w:instrText xml:space="preserve"> PAGEREF _Toc216889940 \h </w:instrText>
+              <w:instrText xml:space="preserve"> PAGEREF _Toc219895144 \h </w:instrText>
             </w:r>
             <w:r>
               <w:rPr>
@@ -1526,7 +1604,7 @@
                 <w:noProof/>
                 <w:webHidden/>
               </w:rPr>
-              <w:t>6</w:t>
+              <w:t>7</w:t>
             </w:r>
             <w:r>
               <w:rPr>
@@ -1552,7 +1630,7 @@
               <w14:ligatures w14:val="standardContextual"/>
             </w:rPr>
           </w:pPr>
-          <w:hyperlink w:anchor="_Toc216889941" w:history="1">
+          <w:hyperlink w:anchor="_Toc219895145" w:history="1">
             <w:r>
               <w:rPr>
                 <w:rStyle w:val="Hyperlink"/>
@@ -1596,7 +1674,7 @@
                 <w:noProof/>
                 <w:webHidden/>
               </w:rPr>
-              <w:instrText xml:space="preserve"> PAGEREF _Toc216889941 \h </w:instrText>
+              <w:instrText xml:space="preserve"> PAGEREF _Toc219895145 \h </w:instrText>
             </w:r>
             <w:r>
               <w:rPr>
@@ -1616,7 +1694,7 @@
                 <w:noProof/>
                 <w:webHidden/>
               </w:rPr>
-              <w:t>6</w:t>
+              <w:t>7</w:t>
             </w:r>
             <w:r>
               <w:rPr>
@@ -1642,7 +1720,7 @@
               <w14:ligatures w14:val="standardContextual"/>
             </w:rPr>
           </w:pPr>
-          <w:hyperlink w:anchor="_Toc216889942" w:history="1">
+          <w:hyperlink w:anchor="_Toc219895146" w:history="1">
             <w:r>
               <w:rPr>
                 <w:rStyle w:val="Hyperlink"/>
@@ -1665,7 +1743,7 @@
                 <w:rStyle w:val="Hyperlink"/>
                 <w:noProof/>
               </w:rPr>
-              <w:t>Data Pre-processing (Intersection Merge)</w:t>
+              <w:t>Explanation of the AI Algorithm</w:t>
             </w:r>
             <w:r>
               <w:rPr>
@@ -1686,7 +1764,7 @@
                 <w:noProof/>
                 <w:webHidden/>
               </w:rPr>
-              <w:instrText xml:space="preserve"> PAGEREF _Toc216889942 \h </w:instrText>
+              <w:instrText xml:space="preserve"> PAGEREF _Toc219895146 \h </w:instrText>
             </w:r>
             <w:r>
               <w:rPr>
@@ -1706,7 +1784,7 @@
                 <w:noProof/>
                 <w:webHidden/>
               </w:rPr>
-              <w:t>6</w:t>
+              <w:t>7</w:t>
             </w:r>
             <w:r>
               <w:rPr>
@@ -1732,7 +1810,7 @@
               <w14:ligatures w14:val="standardContextual"/>
             </w:rPr>
           </w:pPr>
-          <w:hyperlink w:anchor="_Toc216889943" w:history="1">
+          <w:hyperlink w:anchor="_Toc219895147" w:history="1">
             <w:r>
               <w:rPr>
                 <w:rStyle w:val="Hyperlink"/>
@@ -1755,7 +1833,7 @@
                 <w:rStyle w:val="Hyperlink"/>
                 <w:noProof/>
               </w:rPr>
-              <w:t>Feature Engineering (Form and Lag)</w:t>
+              <w:t>Pseudocode of the Solution</w:t>
             </w:r>
             <w:r>
               <w:rPr>
@@ -1776,7 +1854,7 @@
                 <w:noProof/>
                 <w:webHidden/>
               </w:rPr>
-              <w:instrText xml:space="preserve"> PAGEREF _Toc216889943 \h </w:instrText>
+              <w:instrText xml:space="preserve"> PAGEREF _Toc219895147 \h </w:instrText>
             </w:r>
             <w:r>
               <w:rPr>
@@ -1796,7 +1874,7 @@
                 <w:noProof/>
                 <w:webHidden/>
               </w:rPr>
-              <w:t>7</w:t>
+              <w:t>8</w:t>
             </w:r>
             <w:r>
               <w:rPr>
@@ -1822,7 +1900,7 @@
               <w14:ligatures w14:val="standardContextual"/>
             </w:rPr>
           </w:pPr>
-          <w:hyperlink w:anchor="_Toc216889944" w:history="1">
+          <w:hyperlink w:anchor="_Toc219895148" w:history="1">
             <w:r>
               <w:rPr>
                 <w:rStyle w:val="Hyperlink"/>
@@ -1845,7 +1923,7 @@
                 <w:rStyle w:val="Hyperlink"/>
                 <w:noProof/>
               </w:rPr>
-              <w:t>Validation Strategy (Temporal Split)</w:t>
+              <w:t>Diagrammatical Representation</w:t>
             </w:r>
             <w:r>
               <w:rPr>
@@ -1866,7 +1944,7 @@
                 <w:noProof/>
                 <w:webHidden/>
               </w:rPr>
-              <w:instrText xml:space="preserve"> PAGEREF _Toc216889944 \h </w:instrText>
+              <w:instrText xml:space="preserve"> PAGEREF _Toc219895148 \h </w:instrText>
             </w:r>
             <w:r>
               <w:rPr>
@@ -1886,7 +1964,7 @@
                 <w:noProof/>
                 <w:webHidden/>
               </w:rPr>
-              <w:t>7</w:t>
+              <w:t>9</w:t>
             </w:r>
             <w:r>
               <w:rPr>
@@ -1912,7 +1990,7 @@
               <w14:ligatures w14:val="standardContextual"/>
             </w:rPr>
           </w:pPr>
-          <w:hyperlink w:anchor="_Toc216889945" w:history="1">
+          <w:hyperlink w:anchor="_Toc219895149" w:history="1">
             <w:r>
               <w:rPr>
                 <w:rStyle w:val="Hyperlink"/>
@@ -1935,7 +2013,7 @@
                 <w:rStyle w:val="Hyperlink"/>
                 <w:noProof/>
               </w:rPr>
-              <w:t>Evidence and Preliminary Analysis</w:t>
+              <w:t>Development Process</w:t>
             </w:r>
             <w:r>
               <w:rPr>
@@ -1956,7 +2034,7 @@
                 <w:noProof/>
                 <w:webHidden/>
               </w:rPr>
-              <w:instrText xml:space="preserve"> PAGEREF _Toc216889945 \h </w:instrText>
+              <w:instrText xml:space="preserve"> PAGEREF _Toc219895149 \h </w:instrText>
             </w:r>
             <w:r>
               <w:rPr>
@@ -1976,7 +2054,97 @@
                 <w:noProof/>
                 <w:webHidden/>
               </w:rPr>
-              <w:t>7</w:t>
+              <w:t>10</w:t>
+            </w:r>
+            <w:r>
+              <w:rPr>
+                <w:noProof/>
+                <w:webHidden/>
+              </w:rPr>
+              <w:fldChar w:fldCharType="end"/>
+            </w:r>
+          </w:hyperlink>
+        </w:p>
+        <w:p>
+          <w:pPr>
+            <w:pStyle w:val="TOC2"/>
+            <w:tabs>
+              <w:tab w:val="left" w:pos="960"/>
+              <w:tab w:val="right" w:leader="dot" w:pos="9350"/>
+            </w:tabs>
+            <w:rPr>
+              <w:rFonts w:asciiTheme="minorHAnsi" w:eastAsiaTheme="minorEastAsia" w:hAnsiTheme="minorHAnsi" w:cstheme="minorBidi"/>
+              <w:noProof/>
+              <w:kern w:val="2"/>
+              <w:lang w:val="en-US" w:eastAsia="en-US"/>
+              <w14:ligatures w14:val="standardContextual"/>
+            </w:rPr>
+          </w:pPr>
+          <w:hyperlink w:anchor="_Toc219895150" w:history="1">
+            <w:r>
+              <w:rPr>
+                <w:rStyle w:val="Hyperlink"/>
+                <w:noProof/>
+              </w:rPr>
+              <w:t>3.5.</w:t>
+            </w:r>
+            <w:r>
+              <w:rPr>
+                <w:rFonts w:asciiTheme="minorHAnsi" w:eastAsiaTheme="minorEastAsia" w:hAnsiTheme="minorHAnsi" w:cstheme="minorBidi"/>
+                <w:noProof/>
+                <w:kern w:val="2"/>
+                <w:lang w:val="en-US" w:eastAsia="en-US"/>
+                <w14:ligatures w14:val="standardContextual"/>
+              </w:rPr>
+              <w:tab/>
+            </w:r>
+            <w:r>
+              <w:rPr>
+                <w:rStyle w:val="Hyperlink"/>
+                <w:noProof/>
+              </w:rPr>
+              <w:t>Achieved Results</w:t>
+            </w:r>
+            <w:r>
+              <w:rPr>
+                <w:noProof/>
+                <w:webHidden/>
+              </w:rPr>
+              <w:tab/>
+            </w:r>
+            <w:r>
+              <w:rPr>
+                <w:noProof/>
+                <w:webHidden/>
+              </w:rPr>
+              <w:fldChar w:fldCharType="begin"/>
+            </w:r>
+            <w:r>
+              <w:rPr>
+                <w:noProof/>
+                <w:webHidden/>
+              </w:rPr>
+              <w:instrText xml:space="preserve"> PAGEREF _Toc219895150 \h </w:instrText>
+            </w:r>
+            <w:r>
+              <w:rPr>
+                <w:noProof/>
+                <w:webHidden/>
+              </w:rPr>
+            </w:r>
+            <w:r>
+              <w:rPr>
+                <w:noProof/>
+                <w:webHidden/>
+              </w:rPr>
+              <w:fldChar w:fldCharType="separate"/>
+            </w:r>
+            <w:r>
+              <w:rPr>
+                <w:noProof/>
+                <w:webHidden/>
+              </w:rPr>
+              <w:t>10</w:t>
             </w:r>
             <w:r>
               <w:rPr>
@@ -2002,7 +2170,7 @@
               <w14:ligatures w14:val="standardContextual"/>
             </w:rPr>
           </w:pPr>
-          <w:hyperlink w:anchor="_Toc216889946" w:history="1">
+          <w:hyperlink w:anchor="_Toc219895151" w:history="1">
             <w:r>
               <w:rPr>
                 <w:rStyle w:val="Hyperlink"/>
@@ -2046,7 +2214,7 @@
                 <w:noProof/>
                 <w:webHidden/>
               </w:rPr>
-              <w:instrText xml:space="preserve"> PAGEREF _Toc216889946 \h </w:instrText>
+              <w:instrText xml:space="preserve"> PAGEREF _Toc219895151 \h </w:instrText>
             </w:r>
             <w:r>
               <w:rPr>
@@ -2066,7 +2234,7 @@
                 <w:noProof/>
                 <w:webHidden/>
               </w:rPr>
-              <w:t>9</w:t>
+              <w:t>11</w:t>
             </w:r>
             <w:r>
               <w:rPr>
@@ -2092,7 +2260,7 @@
               <w14:ligatures w14:val="standardContextual"/>
             </w:rPr>
           </w:pPr>
-          <w:hyperlink w:anchor="_Toc216889947" w:history="1">
+          <w:hyperlink w:anchor="_Toc219895152" w:history="1">
             <w:r>
               <w:rPr>
                 <w:rStyle w:val="Hyperlink"/>
@@ -2115,7 +2283,7 @@
                 <w:rStyle w:val="Hyperlink"/>
                 <w:noProof/>
               </w:rPr>
-              <w:t>Summary</w:t>
+              <w:t>Analysis of Work Done</w:t>
             </w:r>
             <w:r>
               <w:rPr>
@@ -2136,7 +2304,7 @@
                 <w:noProof/>
                 <w:webHidden/>
               </w:rPr>
-              <w:instrText xml:space="preserve"> PAGEREF _Toc216889947 \h </w:instrText>
+              <w:instrText xml:space="preserve"> PAGEREF _Toc219895152 \h </w:instrText>
             </w:r>
             <w:r>
               <w:rPr>
@@ -2156,7 +2324,7 @@
                 <w:noProof/>
                 <w:webHidden/>
               </w:rPr>
-              <w:t>9</w:t>
+              <w:t>11</w:t>
             </w:r>
             <w:r>
               <w:rPr>
@@ -2182,7 +2350,7 @@
               <w14:ligatures w14:val="standardContextual"/>
             </w:rPr>
           </w:pPr>
-          <w:hyperlink w:anchor="_Toc216889948" w:history="1">
+          <w:hyperlink w:anchor="_Toc219895153" w:history="1">
             <w:r>
               <w:rPr>
                 <w:rStyle w:val="Hyperlink"/>
@@ -2205,7 +2373,7 @@
                 <w:rStyle w:val="Hyperlink"/>
                 <w:noProof/>
               </w:rPr>
-              <w:t>Limitations</w:t>
+              <w:t>Real World Application</w:t>
             </w:r>
             <w:r>
               <w:rPr>
@@ -2226,7 +2394,7 @@
                 <w:noProof/>
                 <w:webHidden/>
               </w:rPr>
-              <w:instrText xml:space="preserve"> PAGEREF _Toc216889948 \h </w:instrText>
+              <w:instrText xml:space="preserve"> PAGEREF _Toc219895153 \h </w:instrText>
             </w:r>
             <w:r>
               <w:rPr>
@@ -2246,7 +2414,7 @@
                 <w:noProof/>
                 <w:webHidden/>
               </w:rPr>
-              <w:t>10</w:t>
+              <w:t>11</w:t>
             </w:r>
             <w:r>
               <w:rPr>
@@ -2272,7 +2440,7 @@
               <w14:ligatures w14:val="standardContextual"/>
             </w:rPr>
           </w:pPr>
-          <w:hyperlink w:anchor="_Toc216889949" w:history="1">
+          <w:hyperlink w:anchor="_Toc219895154" w:history="1">
             <w:r>
               <w:rPr>
                 <w:rStyle w:val="Hyperlink"/>
@@ -2295,7 +2463,7 @@
                 <w:rStyle w:val="Hyperlink"/>
                 <w:noProof/>
               </w:rPr>
-              <w:t>Future Work (Milestone 2)</w:t>
+              <w:t>Further Work</w:t>
             </w:r>
             <w:r>
               <w:rPr>
@@ -2316,7 +2484,7 @@
                 <w:noProof/>
                 <w:webHidden/>
               </w:rPr>
-              <w:instrText xml:space="preserve"> PAGEREF _Toc216889949 \h </w:instrText>
+              <w:instrText xml:space="preserve"> PAGEREF _Toc219895154 \h </w:instrText>
             </w:r>
             <w:r>
               <w:rPr>
@@ -2336,7 +2504,7 @@
                 <w:noProof/>
                 <w:webHidden/>
               </w:rPr>
-              <w:t>10</w:t>
+              <w:t>12</w:t>
             </w:r>
             <w:r>
               <w:rPr>
@@ -2361,7 +2529,7 @@
               <w14:ligatures w14:val="standardContextual"/>
             </w:rPr>
           </w:pPr>
-          <w:hyperlink w:anchor="_Toc216889950" w:history="1">
+          <w:hyperlink w:anchor="_Toc219895155" w:history="1">
             <w:r>
               <w:rPr>
                 <w:rStyle w:val="Hyperlink"/>
@@ -2388,7 +2556,7 @@
                 <w:noProof/>
                 <w:webHidden/>
               </w:rPr>
-              <w:instrText xml:space="preserve"> PAGEREF _Toc216889950 \h </w:instrText>
+              <w:instrText xml:space="preserve"> PAGEREF _Toc219895155 \h </w:instrText>
             </w:r>
             <w:r>
               <w:rPr>
@@ -2408,7 +2576,7 @@
                 <w:noProof/>
                 <w:webHidden/>
               </w:rPr>
-              <w:t>10</w:t>
+              <w:t>12</w:t>
             </w:r>
             <w:r>
               <w:rPr>
@@ -2442,9 +2610,14 @@
       <w:pPr>
         <w:pStyle w:val="Heading1"/>
       </w:pPr>
+      <w:bookmarkStart w:id="0" w:name="_Toc219895135"/>
       <w:r>
         <w:lastRenderedPageBreak/>
-        <w:t xml:space="preserve">Table of Tables </w:t>
+        <w:t>Table of Tables</w:t>
+      </w:r>
+      <w:bookmarkEnd w:id="0"/>
+      <w:r>
+        <w:t xml:space="preserve"> </w:t>
       </w:r>
     </w:p>
     <w:p>
@@ -2454,7 +2627,11 @@
           <w:tab w:val="right" w:leader="dot" w:pos="9350"/>
         </w:tabs>
         <w:rPr>
+          <w:rFonts w:asciiTheme="minorHAnsi" w:eastAsiaTheme="minorEastAsia" w:hAnsiTheme="minorHAnsi" w:cstheme="minorBidi"/>
           <w:noProof/>
+          <w:kern w:val="2"/>
+          <w:lang w:val="en-US" w:eastAsia="en-US"/>
+          <w14:ligatures w14:val="standardContextual"/>
         </w:rPr>
       </w:pPr>
       <w:r>
@@ -2466,13 +2643,13 @@
       <w:r>
         <w:fldChar w:fldCharType="separate"/>
       </w:r>
-      <w:hyperlink w:anchor="_Toc216889969" w:history="1">
+      <w:hyperlink w:anchor="_Toc219895156" w:history="1">
         <w:r>
           <w:rPr>
             <w:rStyle w:val="Hyperlink"/>
             <w:noProof/>
           </w:rPr>
-          <w:t>Figure 1: Feature Correlation Heatmap</w:t>
+          <w:t>Figure 1: System Flowchart illustrating the Hybrid Architecture pipeline.</w:t>
         </w:r>
         <w:r>
           <w:rPr>
@@ -2493,7 +2670,7 @@
             <w:noProof/>
             <w:webHidden/>
           </w:rPr>
-          <w:instrText xml:space="preserve"> PAGEREF _Toc216889969 \h </w:instrText>
+          <w:instrText xml:space="preserve"> PAGEREF _Toc219895156 \h </w:instrText>
         </w:r>
         <w:r>
           <w:rPr>
@@ -2531,16 +2708,20 @@
           <w:tab w:val="right" w:leader="dot" w:pos="9350"/>
         </w:tabs>
         <w:rPr>
+          <w:rFonts w:asciiTheme="minorHAnsi" w:eastAsiaTheme="minorEastAsia" w:hAnsiTheme="minorHAnsi" w:cstheme="minorBidi"/>
           <w:noProof/>
-        </w:rPr>
-      </w:pPr>
-      <w:hyperlink w:anchor="_Toc216889970" w:history="1">
+          <w:kern w:val="2"/>
+          <w:lang w:val="en-US" w:eastAsia="en-US"/>
+          <w14:ligatures w14:val="standardContextual"/>
+        </w:rPr>
+      </w:pPr>
+      <w:hyperlink w:anchor="_Toc219895157" w:history="1">
         <w:r>
           <w:rPr>
             <w:rStyle w:val="Hyperlink"/>
             <w:noProof/>
           </w:rPr>
-          <w:t>Figure 2: Scatter Plot of Form vs. Points</w:t>
+          <w:t>Figure 2: The Main Prediction Dashboard showing top 5 Recommended Captains.</w:t>
         </w:r>
         <w:r>
           <w:rPr>
@@ -2561,7 +2742,7 @@
             <w:noProof/>
             <w:webHidden/>
           </w:rPr>
-          <w:instrText xml:space="preserve"> PAGEREF _Toc216889970 \h </w:instrText>
+          <w:instrText xml:space="preserve"> PAGEREF _Toc219895157 \h </w:instrText>
         </w:r>
         <w:r>
           <w:rPr>
@@ -2594,6 +2775,78 @@
     </w:p>
     <w:p>
       <w:pPr>
+        <w:pStyle w:val="TableofFigures"/>
+        <w:tabs>
+          <w:tab w:val="right" w:leader="dot" w:pos="9350"/>
+        </w:tabs>
+        <w:rPr>
+          <w:rFonts w:asciiTheme="minorHAnsi" w:eastAsiaTheme="minorEastAsia" w:hAnsiTheme="minorHAnsi" w:cstheme="minorBidi"/>
+          <w:noProof/>
+          <w:kern w:val="2"/>
+          <w:lang w:val="en-US" w:eastAsia="en-US"/>
+          <w14:ligatures w14:val="standardContextual"/>
+        </w:rPr>
+      </w:pPr>
+      <w:hyperlink w:anchor="_Toc219895158" w:history="1">
+        <w:r>
+          <w:rPr>
+            <w:rStyle w:val="Hyperlink"/>
+            <w:noProof/>
+          </w:rPr>
+          <w:t>Figure 3: The Historical Validation Interface allowing users to test accuracy on past gameweeks.</w:t>
+        </w:r>
+        <w:r>
+          <w:rPr>
+            <w:noProof/>
+            <w:webHidden/>
+          </w:rPr>
+          <w:tab/>
+        </w:r>
+        <w:r>
+          <w:rPr>
+            <w:noProof/>
+            <w:webHidden/>
+          </w:rPr>
+          <w:fldChar w:fldCharType="begin"/>
+        </w:r>
+        <w:r>
+          <w:rPr>
+            <w:noProof/>
+            <w:webHidden/>
+          </w:rPr>
+          <w:instrText xml:space="preserve"> PAGEREF _Toc219895158 \h </w:instrText>
+        </w:r>
+        <w:r>
+          <w:rPr>
+            <w:noProof/>
+            <w:webHidden/>
+          </w:rPr>
+        </w:r>
+        <w:r>
+          <w:rPr>
+            <w:noProof/>
+            <w:webHidden/>
+          </w:rPr>
+          <w:fldChar w:fldCharType="separate"/>
+        </w:r>
+        <w:r>
+          <w:rPr>
+            <w:noProof/>
+            <w:webHidden/>
+          </w:rPr>
+          <w:t>11</w:t>
+        </w:r>
+        <w:r>
+          <w:rPr>
+            <w:noProof/>
+            <w:webHidden/>
+          </w:rPr>
+          <w:fldChar w:fldCharType="end"/>
+        </w:r>
+      </w:hyperlink>
+    </w:p>
+    <w:p>
+      <w:pPr>
         <w:jc w:val="left"/>
         <w:rPr>
           <w:b/>
@@ -2614,7 +2867,10 @@
       </w:pPr>
       <w:r>
         <w:lastRenderedPageBreak/>
-        <w:t>Predicting FPL Points</w:t>
+        <w:t>Catalan FPL P</w:t>
+      </w:r>
+      <w:r>
+        <w:t>redictor`</w:t>
       </w:r>
     </w:p>
     <w:p/>
@@ -2626,11 +2882,11 @@
           <w:numId w:val="1"/>
         </w:numPr>
       </w:pPr>
-      <w:bookmarkStart w:id="0" w:name="_Toc216889932"/>
+      <w:bookmarkStart w:id="1" w:name="_Toc219895136"/>
       <w:r>
         <w:t>Introduction</w:t>
       </w:r>
-      <w:bookmarkEnd w:id="0"/>
+      <w:bookmarkEnd w:id="1"/>
     </w:p>
     <w:p/>
     <w:p>
@@ -2641,16 +2897,16 @@
           <w:numId w:val="1"/>
         </w:numPr>
       </w:pPr>
-      <w:bookmarkStart w:id="1" w:name="_Toc216889933"/>
+      <w:bookmarkStart w:id="2" w:name="_Toc219895137"/>
       <w:r>
         <w:t>The Problem Domain</w:t>
       </w:r>
-      <w:bookmarkEnd w:id="1"/>
+      <w:bookmarkEnd w:id="2"/>
     </w:p>
     <w:p/>
     <w:p>
       <w:pPr>
-        <w:ind w:left="360"/>
+        <w:ind w:left="360" w:firstLine="360"/>
       </w:pPr>
       <w:r>
         <w:t>Fantasy Premier Le</w:t>
@@ -2664,11 +2920,9 @@
       <w:r>
         <w:t xml:space="preserve"> a great knowledge of prediction. Where the managers predict which players might perform well in the upcoming matches. </w:t>
       </w:r>
-      <w:proofErr w:type="gramStart"/>
-      <w:r>
-        <w:t>But,</w:t>
-      </w:r>
-      <w:proofErr w:type="gramEnd"/>
+      <w:r>
+        <w:t>But</w:t>
+      </w:r>
       <w:r>
         <w:t xml:space="preserve"> human decision-making is often flawed, mostly because of cognitive biases such as recency bias or club bias. Often novice manager </w:t>
       </w:r>
@@ -2691,11 +2945,11 @@
           <w:numId w:val="1"/>
         </w:numPr>
       </w:pPr>
-      <w:bookmarkStart w:id="2" w:name="_Toc216889934"/>
+      <w:bookmarkStart w:id="3" w:name="_Toc219895138"/>
       <w:r>
         <w:t>Project Aim</w:t>
       </w:r>
-      <w:bookmarkEnd w:id="2"/>
+      <w:bookmarkEnd w:id="3"/>
       <w:r>
         <w:t xml:space="preserve"> </w:t>
       </w:r>
@@ -2703,7 +2957,7 @@
     <w:p/>
     <w:p>
       <w:pPr>
-        <w:ind w:left="360"/>
+        <w:ind w:left="360" w:firstLine="360"/>
       </w:pPr>
       <w:r>
         <w:t xml:space="preserve">The </w:t>
@@ -2733,7 +2987,13 @@
         <w:t>a player</w:t>
       </w:r>
       <w:r>
-        <w:t xml:space="preserve"> will score in the next Game week. This system will help FPL managers to identify high-value players based on statistics (Form) rather than insights.</w:t>
+        <w:t xml:space="preserve"> will score in the next Game week. This system help</w:t>
+      </w:r>
+      <w:r>
+        <w:t>s</w:t>
+      </w:r>
+      <w:r>
+        <w:t xml:space="preserve"> FPL managers to identify high-value players based on statistics (Form) rather than insights.</w:t>
       </w:r>
     </w:p>
     <w:p/>
@@ -2745,16 +3005,16 @@
           <w:numId w:val="1"/>
         </w:numPr>
       </w:pPr>
-      <w:bookmarkStart w:id="3" w:name="_Toc216889935"/>
+      <w:bookmarkStart w:id="4" w:name="_Toc219895139"/>
       <w:r>
         <w:t>AI Agent Definition (PEAS Framework)</w:t>
       </w:r>
-      <w:bookmarkEnd w:id="3"/>
+      <w:bookmarkEnd w:id="4"/>
     </w:p>
     <w:p/>
     <w:p>
       <w:pPr>
-        <w:ind w:left="360"/>
+        <w:ind w:left="360" w:firstLine="360"/>
       </w:pPr>
       <w:r>
         <w:t>“</w:t>
@@ -2797,18 +3057,28 @@
     </w:p>
     <w:p>
       <w:pPr>
-        <w:ind w:left="360"/>
+        <w:ind w:left="360" w:firstLine="360"/>
       </w:pPr>
       <w:r>
         <w:t xml:space="preserve">The design of this FPL prediction project is to be a Goal-Based Agent. The main goal is to accurately predict the total points for each and specific players in the upcoming </w:t>
       </w:r>
-      <w:proofErr w:type="spellStart"/>
-      <w:r>
-        <w:t>gameweek</w:t>
-      </w:r>
-      <w:proofErr w:type="spellEnd"/>
-      <w:r>
-        <w:t>. Which will be defined by using the standard PEAS framework:</w:t>
+      <w:r>
+        <w:t>game week</w:t>
+      </w:r>
+      <w:r>
+        <w:t xml:space="preserve">. Which </w:t>
+      </w:r>
+      <w:r>
+        <w:t>had</w:t>
+      </w:r>
+      <w:r>
+        <w:t xml:space="preserve"> be</w:t>
+      </w:r>
+      <w:r>
+        <w:t>en</w:t>
+      </w:r>
+      <w:r>
+        <w:t xml:space="preserve"> defined by using the standard PEAS framework:</w:t>
       </w:r>
     </w:p>
     <w:p>
@@ -2833,10 +3103,28 @@
     </w:p>
     <w:p>
       <w:pPr>
-        <w:ind w:left="360"/>
-      </w:pPr>
-      <w:r>
-        <w:t xml:space="preserve">For the regression agent, the success will be determined by how close the predicted points are to the actual points achieved by the players. Which will define the criteria for the success. </w:t>
+        <w:ind w:left="360" w:firstLine="360"/>
+      </w:pPr>
+      <w:r>
+        <w:t xml:space="preserve">For the regression agent, the success </w:t>
+      </w:r>
+      <w:r>
+        <w:t>has</w:t>
+      </w:r>
+      <w:r>
+        <w:t xml:space="preserve"> be</w:t>
+      </w:r>
+      <w:r>
+        <w:t>en</w:t>
+      </w:r>
+      <w:r>
+        <w:t xml:space="preserve"> determined by how close the predicted points are to the actual points achieved by the players. Which define</w:t>
+      </w:r>
+      <w:r>
+        <w:t>s</w:t>
+      </w:r>
+      <w:r>
+        <w:t xml:space="preserve"> the criteria for the success. </w:t>
       </w:r>
     </w:p>
     <w:p>
@@ -2907,7 +3195,7 @@
     </w:p>
     <w:p>
       <w:pPr>
-        <w:ind w:left="360"/>
+        <w:ind w:left="360" w:firstLine="360"/>
       </w:pPr>
       <w:r>
         <w:t xml:space="preserve">The environment is the domain in which the AI agent operates, based on specific properties the environments can be classified. </w:t>
@@ -2964,7 +3252,13 @@
         <w:t>Fully Observable</w:t>
       </w:r>
       <w:r>
-        <w:t xml:space="preserve">: The agent will have the complete access of the data (all columns like ICT Index, Minutes, and Goals). There </w:t>
+        <w:t xml:space="preserve">: The agent </w:t>
+      </w:r>
+      <w:r>
+        <w:t xml:space="preserve">has </w:t>
+      </w:r>
+      <w:r>
+        <w:t xml:space="preserve">the complete access of the data (all columns like ICT Index, Minutes, and Goals). There </w:t>
       </w:r>
       <w:proofErr w:type="gramStart"/>
       <w:r>
@@ -3040,7 +3334,19 @@
         <w:t>:</w:t>
       </w:r>
       <w:r>
-        <w:t xml:space="preserve"> the historical training data from season 2021 to 2025 will not change while the agent is in the training phase. The past stats are fixed during the analysis.</w:t>
+        <w:t xml:space="preserve"> the historical training data from season 2021 to 202</w:t>
+      </w:r>
+      <w:r>
+        <w:t>5</w:t>
+      </w:r>
+      <w:r>
+        <w:t xml:space="preserve"> </w:t>
+      </w:r>
+      <w:r>
+        <w:t xml:space="preserve">does </w:t>
+      </w:r>
+      <w:r>
+        <w:t>not change while the agent is in the training phase. The past stats are fixed during the analysis.</w:t>
       </w:r>
     </w:p>
     <w:p>
@@ -3266,12 +3572,12 @@
           <w:numId w:val="1"/>
         </w:numPr>
       </w:pPr>
-      <w:bookmarkStart w:id="4" w:name="_Toc216889936"/>
+      <w:bookmarkStart w:id="5" w:name="_Toc219895140"/>
       <w:r>
         <w:lastRenderedPageBreak/>
         <w:t>Background</w:t>
       </w:r>
-      <w:bookmarkEnd w:id="4"/>
+      <w:bookmarkEnd w:id="5"/>
     </w:p>
     <w:p>
       <w:pPr>
@@ -3286,16 +3592,16 @@
           <w:numId w:val="1"/>
         </w:numPr>
       </w:pPr>
-      <w:bookmarkStart w:id="5" w:name="_Toc216889937"/>
+      <w:bookmarkStart w:id="6" w:name="_Toc219895141"/>
       <w:r>
         <w:t>Dataset Description</w:t>
       </w:r>
-      <w:bookmarkEnd w:id="5"/>
+      <w:bookmarkEnd w:id="6"/>
     </w:p>
     <w:p/>
     <w:p>
       <w:pPr>
-        <w:ind w:left="360"/>
+        <w:ind w:left="360" w:firstLine="360"/>
       </w:pPr>
       <w:r>
         <w:t xml:space="preserve">The data is sourced from the Vaastav Anand Fantasy Premier League Repository on GitHub, </w:t>
@@ -3379,16 +3685,16 @@
           <w:numId w:val="1"/>
         </w:numPr>
       </w:pPr>
-      <w:bookmarkStart w:id="6" w:name="_Toc216889938"/>
+      <w:bookmarkStart w:id="7" w:name="_Toc219895142"/>
       <w:r>
         <w:t>Theoretical Model: Multiple Linear Regression</w:t>
       </w:r>
-      <w:bookmarkEnd w:id="6"/>
+      <w:bookmarkEnd w:id="7"/>
     </w:p>
     <w:p/>
     <w:p>
       <w:pPr>
-        <w:ind w:left="360"/>
+        <w:ind w:left="360" w:firstLine="360"/>
       </w:pPr>
       <w:r>
         <w:t>Multiple Linear Regression has been chosen as the core algorithm. Designed to predict continuous variables (Points), unlike other classification modes that predict categorical outcomes a win/loss.</w:t>
@@ -3396,7 +3702,7 @@
     </w:p>
     <w:p>
       <w:pPr>
-        <w:ind w:left="360"/>
+        <w:ind w:left="360" w:firstLine="360"/>
       </w:pPr>
       <w:r>
         <w:t>The linear relationship between the independent input variables (X) and the dependent target variable (</w:t>
@@ -3425,12 +3731,14 @@
           <w:rFonts w:cs="Times New Roman"/>
           <w:i/>
           <w:iCs/>
+          <w:highlight w:val="yellow"/>
         </w:rPr>
         <w:t>y</w:t>
       </w:r>
       <w:r>
         <w:rPr>
           <w:rFonts w:cs="Times New Roman"/>
+          <w:highlight w:val="yellow"/>
         </w:rPr>
         <w:t xml:space="preserve"> = </w:t>
       </w:r>
@@ -3439,6 +3747,7 @@
           <w:rFonts w:cs="Times New Roman"/>
           <w:i/>
           <w:iCs/>
+          <w:highlight w:val="yellow"/>
         </w:rPr>
         <w:t>β</w:t>
       </w:r>
@@ -3447,6 +3756,7 @@
           <w:rFonts w:cs="Times New Roman"/>
           <w:sz w:val="20"/>
           <w:szCs w:val="20"/>
+          <w:highlight w:val="yellow"/>
           <w:vertAlign w:val="subscript"/>
         </w:rPr>
         <w:t>0</w:t>
@@ -3454,6 +3764,7 @@
       <w:r>
         <w:rPr>
           <w:rFonts w:cs="Times New Roman"/>
+          <w:highlight w:val="yellow"/>
         </w:rPr>
         <w:t xml:space="preserve"> + </w:t>
       </w:r>
@@ -3462,6 +3773,7 @@
           <w:rFonts w:cs="Times New Roman"/>
           <w:i/>
           <w:iCs/>
+          <w:highlight w:val="yellow"/>
         </w:rPr>
         <w:t>β</w:t>
       </w:r>
@@ -3470,6 +3782,7 @@
           <w:rFonts w:cs="Times New Roman"/>
           <w:sz w:val="20"/>
           <w:szCs w:val="20"/>
+          <w:highlight w:val="yellow"/>
           <w:vertAlign w:val="subscript"/>
         </w:rPr>
         <w:t>1</w:t>
@@ -3479,6 +3792,7 @@
           <w:rFonts w:cs="Times New Roman"/>
           <w:i/>
           <w:iCs/>
+          <w:highlight w:val="yellow"/>
         </w:rPr>
         <w:t>x</w:t>
       </w:r>
@@ -3487,6 +3801,7 @@
           <w:rFonts w:cs="Times New Roman"/>
           <w:sz w:val="20"/>
           <w:szCs w:val="20"/>
+          <w:highlight w:val="yellow"/>
           <w:vertAlign w:val="subscript"/>
         </w:rPr>
         <w:t>1</w:t>
@@ -3494,6 +3809,7 @@
       <w:r>
         <w:rPr>
           <w:rFonts w:cs="Times New Roman"/>
+          <w:highlight w:val="yellow"/>
         </w:rPr>
         <w:t xml:space="preserve"> + </w:t>
       </w:r>
@@ -3502,6 +3818,7 @@
           <w:rFonts w:cs="Times New Roman"/>
           <w:i/>
           <w:iCs/>
+          <w:highlight w:val="yellow"/>
         </w:rPr>
         <w:t>β</w:t>
       </w:r>
@@ -3510,6 +3827,7 @@
           <w:rFonts w:cs="Times New Roman"/>
           <w:sz w:val="20"/>
           <w:szCs w:val="20"/>
+          <w:highlight w:val="yellow"/>
           <w:vertAlign w:val="subscript"/>
         </w:rPr>
         <w:t>2</w:t>
@@ -3519,6 +3837,7 @@
           <w:rFonts w:cs="Times New Roman"/>
           <w:i/>
           <w:iCs/>
+          <w:highlight w:val="yellow"/>
         </w:rPr>
         <w:t>x</w:t>
       </w:r>
@@ -3527,6 +3846,7 @@
           <w:rFonts w:cs="Times New Roman"/>
           <w:sz w:val="20"/>
           <w:szCs w:val="20"/>
+          <w:highlight w:val="yellow"/>
           <w:vertAlign w:val="subscript"/>
         </w:rPr>
         <w:t>2</w:t>
@@ -3534,6 +3854,7 @@
       <w:r>
         <w:rPr>
           <w:rFonts w:cs="Times New Roman"/>
+          <w:highlight w:val="yellow"/>
         </w:rPr>
         <w:t xml:space="preserve"> + …. + </w:t>
       </w:r>
@@ -3542,6 +3863,7 @@
           <w:rFonts w:cs="Times New Roman"/>
           <w:i/>
           <w:iCs/>
+          <w:highlight w:val="yellow"/>
         </w:rPr>
         <w:t>β</w:t>
       </w:r>
@@ -3551,6 +3873,7 @@
           <w:rFonts w:cs="Times New Roman"/>
           <w:sz w:val="20"/>
           <w:szCs w:val="20"/>
+          <w:highlight w:val="yellow"/>
           <w:vertAlign w:val="subscript"/>
         </w:rPr>
         <w:t>n</w:t>
@@ -3560,6 +3883,7 @@
           <w:rFonts w:cs="Times New Roman"/>
           <w:i/>
           <w:iCs/>
+          <w:highlight w:val="yellow"/>
         </w:rPr>
         <w:t>x</w:t>
       </w:r>
@@ -3568,6 +3892,7 @@
           <w:rFonts w:cs="Times New Roman"/>
           <w:sz w:val="20"/>
           <w:szCs w:val="20"/>
+          <w:highlight w:val="yellow"/>
           <w:vertAlign w:val="subscript"/>
         </w:rPr>
         <w:t>n</w:t>
@@ -3576,6 +3901,7 @@
       <w:r>
         <w:rPr>
           <w:rFonts w:cs="Times New Roman"/>
+          <w:highlight w:val="yellow"/>
         </w:rPr>
         <w:t xml:space="preserve"> + </w:t>
       </w:r>
@@ -3584,6 +3910,7 @@
           <w:rFonts w:cs="Times New Roman"/>
           <w:i/>
           <w:iCs/>
+          <w:highlight w:val="yellow"/>
         </w:rPr>
         <w:t>ε</w:t>
       </w:r>
@@ -3671,16 +3998,7 @@
           <w:szCs w:val="20"/>
           <w:vertAlign w:val="subscript"/>
         </w:rPr>
-        <w:t>2</w:t>
-      </w:r>
-      <w:r>
-        <w:rPr>
-          <w:rFonts w:cs="Times New Roman"/>
-          <w:sz w:val="20"/>
-          <w:szCs w:val="20"/>
-          <w:vertAlign w:val="subscript"/>
-        </w:rPr>
-        <w:t xml:space="preserve"> </w:t>
+        <w:t xml:space="preserve">2 </w:t>
       </w:r>
       <w:r>
         <w:rPr>
@@ -3751,16 +4069,16 @@
           <w:numId w:val="1"/>
         </w:numPr>
       </w:pPr>
-      <w:bookmarkStart w:id="7" w:name="_Toc216889939"/>
+      <w:bookmarkStart w:id="8" w:name="_Toc219895143"/>
       <w:r>
         <w:t>The Learning Process (Sum of Squared Errors)</w:t>
       </w:r>
-      <w:bookmarkEnd w:id="7"/>
+      <w:bookmarkEnd w:id="8"/>
     </w:p>
     <w:p/>
     <w:p>
       <w:pPr>
-        <w:ind w:left="360"/>
+        <w:ind w:left="360" w:firstLine="360"/>
       </w:pPr>
       <w:r>
         <w:t xml:space="preserve">By minimizing the error between its predictions and the actual results, is how the model learns the optimal weights. Which is achieved by minimizing the Sum of Squared Errors (SSE). </w:t>
@@ -3782,6 +4100,7 @@
             </m:rPr>
             <w:rPr>
               <w:rFonts w:ascii="Cambria Math" w:hAnsi="Cambria Math"/>
+              <w:highlight w:val="yellow"/>
               <w:lang w:val="en-US"/>
             </w:rPr>
             <m:t xml:space="preserve">SSE = </m:t>
@@ -3794,6 +4113,7 @@
                   <w:i/>
                   <w:sz w:val="56"/>
                   <w:szCs w:val="56"/>
+                  <w:highlight w:val="yellow"/>
                 </w:rPr>
               </m:ctrlPr>
             </m:sSupPr>
@@ -3808,6 +4128,7 @@
                       <w:i/>
                       <w:sz w:val="56"/>
                       <w:szCs w:val="56"/>
+                      <w:highlight w:val="yellow"/>
                     </w:rPr>
                   </m:ctrlPr>
                 </m:naryPr>
@@ -3817,6 +4138,7 @@
                       <w:rFonts w:ascii="Cambria Math" w:hAnsi="Cambria Math" w:cs="Times New Roman"/>
                       <w:sz w:val="56"/>
                       <w:szCs w:val="56"/>
+                      <w:highlight w:val="yellow"/>
                     </w:rPr>
                     <m:t>i=1</m:t>
                   </m:r>
@@ -3827,6 +4149,7 @@
                       <w:rFonts w:ascii="Cambria Math" w:hAnsi="Cambria Math" w:cs="Times New Roman"/>
                       <w:sz w:val="56"/>
                       <w:szCs w:val="56"/>
+                      <w:highlight w:val="yellow"/>
                     </w:rPr>
                     <m:t>n</m:t>
                   </m:r>
@@ -3837,6 +4160,7 @@
                       <w:rFonts w:ascii="Cambria Math" w:hAnsi="Cambria Math" w:cs="Times New Roman"/>
                       <w:sz w:val="56"/>
                       <w:szCs w:val="56"/>
+                      <w:highlight w:val="yellow"/>
                     </w:rPr>
                     <m:t>(</m:t>
                   </m:r>
@@ -3848,6 +4172,7 @@
                           <w:i/>
                           <w:sz w:val="56"/>
                           <w:szCs w:val="56"/>
+                          <w:highlight w:val="yellow"/>
                         </w:rPr>
                       </m:ctrlPr>
                     </m:sSubPr>
@@ -3857,6 +4182,7 @@
                           <w:rFonts w:ascii="Cambria Math" w:hAnsi="Cambria Math" w:cs="Times New Roman"/>
                           <w:sz w:val="56"/>
                           <w:szCs w:val="56"/>
+                          <w:highlight w:val="yellow"/>
                         </w:rPr>
                         <m:t>y</m:t>
                       </m:r>
@@ -3867,6 +4193,7 @@
                           <w:rFonts w:ascii="Cambria Math" w:hAnsi="Cambria Math" w:cs="Times New Roman"/>
                           <w:sz w:val="56"/>
                           <w:szCs w:val="56"/>
+                          <w:highlight w:val="yellow"/>
                         </w:rPr>
                         <m:t>i</m:t>
                       </m:r>
@@ -3877,6 +4204,7 @@
                       <w:rFonts w:ascii="Cambria Math" w:hAnsi="Cambria Math" w:cs="Times New Roman"/>
                       <w:sz w:val="56"/>
                       <w:szCs w:val="56"/>
+                      <w:highlight w:val="yellow"/>
                     </w:rPr>
                     <m:t>-</m:t>
                   </m:r>
@@ -3888,6 +4216,7 @@
                           <w:i/>
                           <w:sz w:val="56"/>
                           <w:szCs w:val="56"/>
+                          <w:highlight w:val="yellow"/>
                         </w:rPr>
                       </m:ctrlPr>
                     </m:sSubPr>
@@ -3900,6 +4229,7 @@
                               <w:i/>
                               <w:sz w:val="56"/>
                               <w:szCs w:val="56"/>
+                              <w:highlight w:val="yellow"/>
                             </w:rPr>
                           </m:ctrlPr>
                         </m:accPr>
@@ -3909,6 +4239,7 @@
                               <w:rFonts w:ascii="Cambria Math" w:hAnsi="Cambria Math" w:cs="Times New Roman"/>
                               <w:sz w:val="56"/>
                               <w:szCs w:val="56"/>
+                              <w:highlight w:val="yellow"/>
                             </w:rPr>
                             <m:t>y</m:t>
                           </m:r>
@@ -3921,6 +4252,7 @@
                           <w:rFonts w:ascii="Cambria Math" w:hAnsi="Cambria Math" w:cs="Times New Roman"/>
                           <w:sz w:val="56"/>
                           <w:szCs w:val="56"/>
+                          <w:highlight w:val="yellow"/>
                         </w:rPr>
                         <m:t>i</m:t>
                       </m:r>
@@ -3931,6 +4263,7 @@
                       <w:rFonts w:ascii="Cambria Math" w:hAnsi="Cambria Math" w:cs="Times New Roman"/>
                       <w:sz w:val="56"/>
                       <w:szCs w:val="56"/>
+                      <w:highlight w:val="yellow"/>
                     </w:rPr>
                     <m:t>)</m:t>
                   </m:r>
@@ -3943,6 +4276,7 @@
                   <w:rFonts w:ascii="Cambria Math" w:hAnsi="Cambria Math" w:cs="Times New Roman"/>
                   <w:sz w:val="56"/>
                   <w:szCs w:val="56"/>
+                  <w:highlight w:val="yellow"/>
                 </w:rPr>
                 <m:t>2</m:t>
               </m:r>
@@ -3980,13 +4314,7 @@
         </m:r>
       </m:oMath>
       <w:r>
-        <w:t xml:space="preserve"> </w:t>
-      </w:r>
-      <w:r>
-        <w:t>(Sigma):</w:t>
-      </w:r>
-      <w:r>
-        <w:t xml:space="preserve"> Summation, which means the algorithm must iterate through every data </w:t>
+        <w:t xml:space="preserve"> (Sigma): Summation, which means the algorithm must iterate through every data </w:t>
       </w:r>
       <w:proofErr w:type="gramStart"/>
       <w:r>
@@ -4074,13 +4402,7 @@
         <w:t>:</w:t>
       </w:r>
       <w:r>
-        <w:t xml:space="preserve"> </w:t>
-      </w:r>
-      <w:r>
-        <w:t>The</w:t>
-      </w:r>
-      <w:r>
-        <w:t xml:space="preserve"> Actual Points achieved by the players.</w:t>
+        <w:t xml:space="preserve"> The Actual Points achieved by the players.</w:t>
       </w:r>
     </w:p>
     <w:p>
@@ -4179,13 +4501,14 @@
         <w:t xml:space="preserve"> The difference </w:t>
       </w:r>
       <w:r>
-        <w:t xml:space="preserve">will not be squared to ensure </w:t>
-      </w:r>
-      <w:proofErr w:type="spellStart"/>
-      <w:r>
-        <w:t>tat</w:t>
-      </w:r>
-      <w:proofErr w:type="spellEnd"/>
+        <w:t>is not</w:t>
+      </w:r>
+      <w:r>
+        <w:t xml:space="preserve"> squared to ensure </w:t>
+      </w:r>
+      <w:r>
+        <w:t>that</w:t>
+      </w:r>
       <w:r>
         <w:t xml:space="preserve"> negative errors do not cancel out positive errors, and to heavily penalize large outliners. </w:t>
       </w:r>
@@ -4203,11 +4526,11 @@
           <w:numId w:val="1"/>
         </w:numPr>
       </w:pPr>
-      <w:bookmarkStart w:id="8" w:name="_Toc216889940"/>
+      <w:bookmarkStart w:id="9" w:name="_Toc219895144"/>
       <w:r>
         <w:t>Literature Review (Alternative Models)</w:t>
       </w:r>
-      <w:bookmarkEnd w:id="8"/>
+      <w:bookmarkEnd w:id="9"/>
     </w:p>
     <w:p/>
     <w:p>
@@ -4316,11 +4639,11 @@
           <w:numId w:val="1"/>
         </w:numPr>
       </w:pPr>
-      <w:bookmarkStart w:id="9" w:name="_Toc216889941"/>
+      <w:bookmarkStart w:id="10" w:name="_Toc219895145"/>
       <w:r>
         <w:t>Solution</w:t>
       </w:r>
-      <w:bookmarkEnd w:id="9"/>
+      <w:bookmarkEnd w:id="10"/>
     </w:p>
     <w:p/>
     <w:p>
@@ -4331,86 +4654,368 @@
           <w:numId w:val="1"/>
         </w:numPr>
       </w:pPr>
-      <w:bookmarkStart w:id="10" w:name="_Toc216889942"/>
-      <w:r>
-        <w:t>Data Pre-processing (Intersection Merge)</w:t>
-      </w:r>
-      <w:bookmarkEnd w:id="10"/>
+      <w:bookmarkStart w:id="11" w:name="_Toc219895146"/>
+      <w:r>
+        <w:t>Explanation of the AI Algorithm</w:t>
+      </w:r>
+      <w:bookmarkEnd w:id="11"/>
     </w:p>
     <w:p/>
     <w:p>
       <w:pPr>
+        <w:ind w:left="360" w:firstLine="360"/>
+      </w:pPr>
+      <w:r>
+        <w:t>Utilizing a Hybrid Architecture which processes data into two different distinct stages:</w:t>
+      </w:r>
+    </w:p>
+    <w:p>
+      <w:pPr>
         <w:ind w:left="360"/>
       </w:pPr>
       <w:r>
-        <w:t xml:space="preserve">The discrepancy between the initial historical </w:t>
-      </w:r>
-      <w:r>
-        <w:t xml:space="preserve">datasets was one of the significant challenges during this project. The data schema was for 2016-2024 and differed from the modern 2024-25 schema </w:t>
-      </w:r>
-      <w:r>
-        <w:t xml:space="preserve">the newer data set had Expected Goals </w:t>
-      </w:r>
-      <w:r>
-        <w:t xml:space="preserve">(xG), </w:t>
-      </w:r>
-      <w:r>
-        <w:t xml:space="preserve">while older ones did not. </w:t>
+        <w:rPr>
+          <w:b/>
+          <w:bCs/>
+        </w:rPr>
+        <w:t>First Stage</w:t>
+      </w:r>
+      <w:r>
+        <w:t>: Linear Regression (Statistical Base)</w:t>
+      </w:r>
+      <w:r>
+        <w:t xml:space="preserve">, The core model has been trained on 75000+ historical rows, which predicts a player’s “Raw Potential” based on: </w:t>
       </w:r>
     </w:p>
     <w:p>
       <w:pPr>
         <w:ind w:left="360"/>
-      </w:pPr>
-      <w:r>
-        <w:t>Implementation of an Intersection Merge was done in Python</w:t>
-      </w:r>
-      <w:r>
-        <w:t xml:space="preserve"> using </w:t>
-      </w:r>
-      <w:proofErr w:type="gramStart"/>
-      <w:r>
-        <w:t>pandas</w:t>
-      </w:r>
-      <w:proofErr w:type="gramEnd"/>
-      <w:r>
-        <w:t xml:space="preserve"> library</w:t>
-      </w:r>
-      <w:r>
-        <w:t xml:space="preserve">, by </w:t>
-      </w:r>
-      <w:r>
-        <w:t xml:space="preserve">programmatically </w:t>
-      </w:r>
-      <w:r>
-        <w:t xml:space="preserve">identifying the 35 common columns available across all </w:t>
-      </w:r>
-      <w:r>
-        <w:t>seasons (Minutes, Goals, ICT Index)</w:t>
-      </w:r>
-      <w:r>
-        <w:t xml:space="preserve"> and discarded mismatched </w:t>
-      </w:r>
-      <w:r>
-        <w:t>features</w:t>
-      </w:r>
-      <w:r>
-        <w:t xml:space="preserve">. Which ensured a consistent feature set across the 5 </w:t>
-      </w:r>
-      <w:r>
-        <w:t>years</w:t>
-      </w:r>
-      <w:r>
-        <w:t xml:space="preserve"> of historical </w:t>
-      </w:r>
-      <w:r>
-        <w:t xml:space="preserve">data, allowing for a robust model training. </w:t>
-      </w:r>
-      <w:r>
-        <w:t xml:space="preserve"> </w:t>
-      </w:r>
-    </w:p>
-    <w:p/>
+        <w:rPr>
+          <w:b/>
+          <w:bCs/>
+        </w:rPr>
+      </w:pPr>
+      <w:r>
+        <w:tab/>
+      </w:r>
+      <w:r>
+        <w:tab/>
+      </w:r>
+      <w:r>
+        <w:tab/>
+      </w:r>
+      <w:r>
+        <w:rPr>
+          <w:rFonts w:cs="Times New Roman"/>
+          <w:b/>
+          <w:bCs/>
+          <w:i/>
+          <w:iCs/>
+          <w:highlight w:val="yellow"/>
+        </w:rPr>
+        <w:t>y</w:t>
+      </w:r>
+      <w:r>
+        <w:rPr>
+          <w:rFonts w:cs="Times New Roman"/>
+          <w:b/>
+          <w:bCs/>
+          <w:highlight w:val="yellow"/>
+        </w:rPr>
+        <w:t xml:space="preserve"> = </w:t>
+      </w:r>
+      <w:r>
+        <w:rPr>
+          <w:rFonts w:cs="Times New Roman"/>
+          <w:b/>
+          <w:bCs/>
+          <w:i/>
+          <w:iCs/>
+          <w:highlight w:val="yellow"/>
+        </w:rPr>
+        <w:t>β</w:t>
+      </w:r>
+      <w:r>
+        <w:rPr>
+          <w:rFonts w:cs="Times New Roman"/>
+          <w:b/>
+          <w:bCs/>
+          <w:sz w:val="20"/>
+          <w:szCs w:val="20"/>
+          <w:highlight w:val="yellow"/>
+          <w:vertAlign w:val="subscript"/>
+        </w:rPr>
+        <w:t>0</w:t>
+      </w:r>
+      <w:r>
+        <w:rPr>
+          <w:rFonts w:cs="Times New Roman"/>
+          <w:b/>
+          <w:bCs/>
+          <w:highlight w:val="yellow"/>
+        </w:rPr>
+        <w:t xml:space="preserve"> + </w:t>
+      </w:r>
+      <w:r>
+        <w:rPr>
+          <w:rFonts w:cs="Times New Roman"/>
+          <w:b/>
+          <w:bCs/>
+          <w:i/>
+          <w:iCs/>
+          <w:highlight w:val="yellow"/>
+        </w:rPr>
+        <w:t>β</w:t>
+      </w:r>
+      <w:r>
+        <w:rPr>
+          <w:rFonts w:cs="Times New Roman"/>
+          <w:b/>
+          <w:bCs/>
+          <w:sz w:val="20"/>
+          <w:szCs w:val="20"/>
+          <w:highlight w:val="yellow"/>
+          <w:vertAlign w:val="subscript"/>
+        </w:rPr>
+        <w:t>1</w:t>
+      </w:r>
+      <w:r>
+        <w:rPr>
+          <w:rFonts w:cs="Times New Roman"/>
+          <w:b/>
+          <w:bCs/>
+          <w:i/>
+          <w:iCs/>
+          <w:highlight w:val="yellow"/>
+        </w:rPr>
+        <w:t xml:space="preserve">(Form) </w:t>
+      </w:r>
+      <w:r>
+        <w:rPr>
+          <w:rFonts w:cs="Times New Roman"/>
+          <w:b/>
+          <w:bCs/>
+          <w:highlight w:val="yellow"/>
+        </w:rPr>
+        <w:t xml:space="preserve">+ </w:t>
+      </w:r>
+      <w:r>
+        <w:rPr>
+          <w:rFonts w:cs="Times New Roman"/>
+          <w:b/>
+          <w:bCs/>
+          <w:i/>
+          <w:iCs/>
+          <w:highlight w:val="yellow"/>
+        </w:rPr>
+        <w:t>β</w:t>
+      </w:r>
+      <w:r>
+        <w:rPr>
+          <w:rFonts w:cs="Times New Roman"/>
+          <w:b/>
+          <w:bCs/>
+          <w:sz w:val="20"/>
+          <w:szCs w:val="20"/>
+          <w:highlight w:val="yellow"/>
+          <w:vertAlign w:val="subscript"/>
+        </w:rPr>
+        <w:t>2</w:t>
+      </w:r>
+      <w:r>
+        <w:rPr>
+          <w:rFonts w:cs="Times New Roman"/>
+          <w:b/>
+          <w:bCs/>
+          <w:i/>
+          <w:iCs/>
+          <w:highlight w:val="yellow"/>
+        </w:rPr>
+        <w:t xml:space="preserve">(ICT Index) </w:t>
+      </w:r>
+      <w:r>
+        <w:rPr>
+          <w:rFonts w:cs="Times New Roman"/>
+          <w:b/>
+          <w:bCs/>
+          <w:highlight w:val="yellow"/>
+        </w:rPr>
+        <w:t xml:space="preserve">+ </w:t>
+      </w:r>
+      <w:r>
+        <w:rPr>
+          <w:rFonts w:cs="Times New Roman"/>
+          <w:b/>
+          <w:bCs/>
+          <w:i/>
+          <w:iCs/>
+          <w:highlight w:val="yellow"/>
+        </w:rPr>
+        <w:t>β</w:t>
+      </w:r>
+      <w:r>
+        <w:rPr>
+          <w:rFonts w:cs="Times New Roman"/>
+          <w:b/>
+          <w:bCs/>
+          <w:sz w:val="20"/>
+          <w:szCs w:val="20"/>
+          <w:highlight w:val="yellow"/>
+          <w:vertAlign w:val="subscript"/>
+        </w:rPr>
+        <w:t>2</w:t>
+      </w:r>
+      <w:r>
+        <w:rPr>
+          <w:rFonts w:cs="Times New Roman"/>
+          <w:b/>
+          <w:bCs/>
+          <w:i/>
+          <w:iCs/>
+          <w:highlight w:val="yellow"/>
+        </w:rPr>
+        <w:t xml:space="preserve">(Value) </w:t>
+      </w:r>
+      <w:r>
+        <w:rPr>
+          <w:rFonts w:cs="Times New Roman"/>
+          <w:b/>
+          <w:bCs/>
+          <w:highlight w:val="yellow"/>
+        </w:rPr>
+        <w:t xml:space="preserve">+ </w:t>
+      </w:r>
+      <w:r>
+        <w:rPr>
+          <w:rFonts w:cs="Times New Roman"/>
+          <w:b/>
+          <w:bCs/>
+          <w:i/>
+          <w:iCs/>
+          <w:highlight w:val="yellow"/>
+        </w:rPr>
+        <w:t>ε</w:t>
+      </w:r>
+      <w:r>
+        <w:rPr>
+          <w:rFonts w:cs="Times New Roman"/>
+          <w:b/>
+          <w:bCs/>
+        </w:rPr>
+        <w:t xml:space="preserve">  </w:t>
+      </w:r>
+    </w:p>
+    <w:p>
+      <w:pPr>
+        <w:ind w:left="360"/>
+      </w:pPr>
+      <w:r>
+        <w:t>Which captures the statistical baseline of the player.</w:t>
+      </w:r>
+    </w:p>
+    <w:p>
+      <w:pPr>
+        <w:ind w:left="360"/>
+      </w:pPr>
+    </w:p>
+    <w:p>
+      <w:pPr>
+        <w:ind w:left="360"/>
+      </w:pPr>
+    </w:p>
+    <w:p>
+      <w:pPr>
+        <w:ind w:left="360"/>
+      </w:pPr>
+    </w:p>
+    <w:p>
+      <w:pPr>
+        <w:ind w:left="360"/>
+      </w:pPr>
+      <w:r>
+        <w:rPr>
+          <w:b/>
+          <w:bCs/>
+        </w:rPr>
+        <w:lastRenderedPageBreak/>
+        <w:t>Second Stage</w:t>
+      </w:r>
+      <w:r>
+        <w:t xml:space="preserve">: Espert’s Rules, the tactical nuances of football cannot be understood just by Pure regression. </w:t>
+      </w:r>
+      <w:r>
+        <w:t>The application applies a post-processing logic layer:</w:t>
+      </w:r>
+    </w:p>
+    <w:p>
+      <w:pPr>
+        <w:pStyle w:val="ListParagraph"/>
+        <w:numPr>
+          <w:ilvl w:val="0"/>
+          <w:numId w:val="5"/>
+        </w:numPr>
+      </w:pPr>
+      <w:r>
+        <w:t xml:space="preserve">The “Big Club Tax”: Attackers </w:t>
+      </w:r>
+      <w:r>
+        <w:t>who are cheap (&lt; 9.0m) and play for elite clubs (man city, arsenal) to handle rotations of the players.</w:t>
+      </w:r>
+    </w:p>
+    <w:p>
+      <w:pPr>
+        <w:pStyle w:val="ListParagraph"/>
+        <w:numPr>
+          <w:ilvl w:val="0"/>
+          <w:numId w:val="5"/>
+        </w:numPr>
+      </w:pPr>
+      <w:r>
+        <w:t xml:space="preserve">Fixture Difficulty Adjustments: </w:t>
+      </w:r>
+    </w:p>
+    <w:p>
+      <w:pPr>
+        <w:pStyle w:val="ListParagraph"/>
+        <w:numPr>
+          <w:ilvl w:val="1"/>
+          <w:numId w:val="3"/>
+        </w:numPr>
+      </w:pPr>
+      <w:r>
+        <w:t xml:space="preserve">Easy Match: * 1.35 boost. </w:t>
+      </w:r>
+    </w:p>
+    <w:p>
+      <w:pPr>
+        <w:pStyle w:val="ListParagraph"/>
+        <w:numPr>
+          <w:ilvl w:val="1"/>
+          <w:numId w:val="3"/>
+        </w:numPr>
+      </w:pPr>
+      <w:r>
+        <w:t>Hard Match: * 0.70 penalty.</w:t>
+      </w:r>
+    </w:p>
+    <w:p>
+      <w:pPr>
+        <w:pStyle w:val="ListParagraph"/>
+        <w:numPr>
+          <w:ilvl w:val="0"/>
+          <w:numId w:val="5"/>
+        </w:numPr>
+      </w:pPr>
+      <w:r>
+        <w:t xml:space="preserve">Strict Starter Probability: For the “Benchwarmer” issue, </w:t>
+      </w:r>
+      <w:r>
+        <w:t xml:space="preserve">Penalizing the players averaging &lt; 45 minutes, </w:t>
+      </w:r>
+      <w:r>
+        <w:t>reducing their expected points to near zero.</w:t>
+      </w:r>
+    </w:p>
     <w:p/>
     <w:p>
       <w:pPr>
@@ -4420,85 +5025,871 @@
           <w:numId w:val="1"/>
         </w:numPr>
       </w:pPr>
-      <w:bookmarkStart w:id="11" w:name="_Toc216889943"/>
-      <w:r>
+      <w:bookmarkStart w:id="12" w:name="_Toc219895147"/>
+      <w:r>
+        <w:t>Pseudo</w:t>
+      </w:r>
+      <w:r>
+        <w:t>code</w:t>
+      </w:r>
+      <w:r>
+        <w:t xml:space="preserve"> of the Solution</w:t>
+      </w:r>
+      <w:bookmarkEnd w:id="12"/>
+    </w:p>
+    <w:p/>
+    <w:p>
+      <w:pPr>
+        <w:ind w:left="360"/>
+      </w:pPr>
+      <w:r>
+        <w:t xml:space="preserve">The logic within the system, illustrating the </w:t>
+      </w:r>
+      <w:proofErr w:type="spellStart"/>
+      <w:r>
+        <w:rPr>
+          <w:i/>
+          <w:iCs/>
+        </w:rPr>
+        <w:t>make_predictions</w:t>
+      </w:r>
+      <w:proofErr w:type="spellEnd"/>
+      <w:r>
+        <w:t>.</w:t>
+      </w:r>
+    </w:p>
+    <w:p>
+      <w:pPr>
+        <w:ind w:left="360"/>
+      </w:pPr>
+    </w:p>
+    <w:p>
+      <w:pPr>
+        <w:spacing w:line="240" w:lineRule="auto"/>
+        <w:ind w:left="360"/>
+        <w:rPr>
+          <w:highlight w:val="yellow"/>
+        </w:rPr>
+      </w:pPr>
+      <w:r>
+        <w:rPr>
+          <w:highlight w:val="yellow"/>
+        </w:rPr>
+        <w:t xml:space="preserve">FUNCTION </w:t>
+      </w:r>
+      <w:proofErr w:type="spellStart"/>
+      <w:r>
+        <w:rPr>
+          <w:highlight w:val="yellow"/>
+        </w:rPr>
+        <w:t>make_</w:t>
+      </w:r>
+      <w:proofErr w:type="gramStart"/>
+      <w:r>
+        <w:rPr>
+          <w:highlight w:val="yellow"/>
+        </w:rPr>
+        <w:t>predictions</w:t>
+      </w:r>
+      <w:proofErr w:type="spellEnd"/>
+      <w:r>
+        <w:rPr>
+          <w:highlight w:val="yellow"/>
+        </w:rPr>
+        <w:t>(</w:t>
+      </w:r>
+      <w:proofErr w:type="spellStart"/>
+      <w:proofErr w:type="gramEnd"/>
+      <w:r>
+        <w:rPr>
+          <w:highlight w:val="yellow"/>
+        </w:rPr>
+        <w:t>player_data</w:t>
+      </w:r>
+      <w:proofErr w:type="spellEnd"/>
+      <w:r>
+        <w:rPr>
+          <w:highlight w:val="yellow"/>
+        </w:rPr>
+        <w:t>, model):</w:t>
+      </w:r>
+    </w:p>
+    <w:p>
+      <w:pPr>
+        <w:ind w:left="360"/>
+        <w:rPr>
+          <w:highlight w:val="yellow"/>
+        </w:rPr>
+      </w:pPr>
+      <w:r>
+        <w:rPr>
+          <w:highlight w:val="yellow"/>
+        </w:rPr>
+        <w:t xml:space="preserve">    FOR EACH player IN </w:t>
+      </w:r>
+      <w:proofErr w:type="spellStart"/>
+      <w:r>
+        <w:rPr>
+          <w:highlight w:val="yellow"/>
+        </w:rPr>
+        <w:t>player_data</w:t>
+      </w:r>
+      <w:proofErr w:type="spellEnd"/>
+      <w:r>
+        <w:rPr>
+          <w:highlight w:val="yellow"/>
+        </w:rPr>
+        <w:t>:</w:t>
+      </w:r>
+    </w:p>
+    <w:p>
+      <w:pPr>
+        <w:ind w:left="360"/>
+        <w:rPr>
+          <w:highlight w:val="yellow"/>
+        </w:rPr>
+      </w:pPr>
+      <w:r>
+        <w:rPr>
+          <w:highlight w:val="yellow"/>
+        </w:rPr>
+        <w:t xml:space="preserve">        # Step 1: Statistical Prediction</w:t>
+      </w:r>
+    </w:p>
+    <w:p>
+      <w:pPr>
+        <w:ind w:left="360"/>
+        <w:rPr>
+          <w:highlight w:val="yellow"/>
+        </w:rPr>
+      </w:pPr>
+      <w:r>
+        <w:rPr>
+          <w:highlight w:val="yellow"/>
+        </w:rPr>
+        <w:t xml:space="preserve">        </w:t>
+      </w:r>
+      <w:proofErr w:type="spellStart"/>
+      <w:r>
+        <w:rPr>
+          <w:highlight w:val="yellow"/>
+        </w:rPr>
+        <w:t>input_vector</w:t>
+      </w:r>
+      <w:proofErr w:type="spellEnd"/>
+      <w:r>
+        <w:rPr>
+          <w:highlight w:val="yellow"/>
+        </w:rPr>
+        <w:t xml:space="preserve"> = [Form, </w:t>
+      </w:r>
+      <w:proofErr w:type="spellStart"/>
+      <w:r>
+        <w:rPr>
+          <w:highlight w:val="yellow"/>
+        </w:rPr>
+        <w:t>ICT_Index</w:t>
+      </w:r>
+      <w:proofErr w:type="spellEnd"/>
+      <w:r>
+        <w:rPr>
+          <w:highlight w:val="yellow"/>
+        </w:rPr>
+        <w:t xml:space="preserve">, </w:t>
+      </w:r>
+      <w:proofErr w:type="spellStart"/>
+      <w:r>
+        <w:rPr>
+          <w:highlight w:val="yellow"/>
+        </w:rPr>
+        <w:t>Minutes_Avg</w:t>
+      </w:r>
+      <w:proofErr w:type="spellEnd"/>
+      <w:r>
+        <w:rPr>
+          <w:highlight w:val="yellow"/>
+        </w:rPr>
+        <w:t>, Price]</w:t>
+      </w:r>
+    </w:p>
+    <w:p>
+      <w:pPr>
+        <w:ind w:left="360"/>
+        <w:rPr>
+          <w:highlight w:val="yellow"/>
+        </w:rPr>
+      </w:pPr>
+      <w:r>
+        <w:rPr>
+          <w:highlight w:val="yellow"/>
+        </w:rPr>
+        <w:t xml:space="preserve">        </w:t>
+      </w:r>
+      <w:proofErr w:type="spellStart"/>
+      <w:r>
+        <w:rPr>
+          <w:highlight w:val="yellow"/>
+        </w:rPr>
+        <w:t>raw_xp</w:t>
+      </w:r>
+      <w:proofErr w:type="spellEnd"/>
+      <w:r>
+        <w:rPr>
+          <w:highlight w:val="yellow"/>
+        </w:rPr>
+        <w:t xml:space="preserve"> = </w:t>
+      </w:r>
+      <w:proofErr w:type="spellStart"/>
+      <w:proofErr w:type="gramStart"/>
+      <w:r>
+        <w:rPr>
+          <w:highlight w:val="yellow"/>
+        </w:rPr>
+        <w:t>model.predict</w:t>
+      </w:r>
+      <w:proofErr w:type="spellEnd"/>
+      <w:proofErr w:type="gramEnd"/>
+      <w:r>
+        <w:rPr>
+          <w:highlight w:val="yellow"/>
+        </w:rPr>
+        <w:t>(</w:t>
+      </w:r>
+      <w:proofErr w:type="spellStart"/>
+      <w:r>
+        <w:rPr>
+          <w:highlight w:val="yellow"/>
+        </w:rPr>
+        <w:t>input_vector</w:t>
+      </w:r>
+      <w:proofErr w:type="spellEnd"/>
+      <w:r>
+        <w:rPr>
+          <w:highlight w:val="yellow"/>
+        </w:rPr>
+        <w:t>)</w:t>
+      </w:r>
+    </w:p>
+    <w:p>
+      <w:pPr>
+        <w:ind w:left="360"/>
+        <w:rPr>
+          <w:highlight w:val="yellow"/>
+        </w:rPr>
+      </w:pPr>
+      <w:r>
+        <w:rPr>
+          <w:highlight w:val="yellow"/>
+        </w:rPr>
+        <w:t xml:space="preserve">        # Step 2: Expert Rule Application</w:t>
+      </w:r>
+    </w:p>
+    <w:p>
+      <w:pPr>
+        <w:ind w:left="360"/>
+        <w:rPr>
+          <w:highlight w:val="yellow"/>
+        </w:rPr>
+      </w:pPr>
+      <w:r>
+        <w:rPr>
+          <w:highlight w:val="yellow"/>
+        </w:rPr>
+        <w:t xml:space="preserve">        # Rule A: Starter Probability Curve</w:t>
+      </w:r>
+    </w:p>
+    <w:p>
+      <w:pPr>
+        <w:ind w:left="360"/>
+        <w:rPr>
+          <w:highlight w:val="yellow"/>
+        </w:rPr>
+      </w:pPr>
+      <w:r>
+        <w:rPr>
+          <w:highlight w:val="yellow"/>
+        </w:rPr>
+        <w:t xml:space="preserve">        IF </w:t>
+      </w:r>
+      <w:proofErr w:type="spellStart"/>
+      <w:r>
+        <w:rPr>
+          <w:highlight w:val="yellow"/>
+        </w:rPr>
+        <w:t>average_minutes</w:t>
+      </w:r>
+      <w:proofErr w:type="spellEnd"/>
+      <w:r>
+        <w:rPr>
+          <w:highlight w:val="yellow"/>
+        </w:rPr>
+        <w:t xml:space="preserve"> &gt; 60:</w:t>
+      </w:r>
+    </w:p>
+    <w:p>
+      <w:pPr>
+        <w:ind w:left="360"/>
+        <w:rPr>
+          <w:highlight w:val="yellow"/>
+        </w:rPr>
+      </w:pPr>
+      <w:r>
+        <w:rPr>
+          <w:highlight w:val="yellow"/>
+        </w:rPr>
+        <w:t xml:space="preserve">            </w:t>
+      </w:r>
+      <w:proofErr w:type="spellStart"/>
+      <w:r>
+        <w:rPr>
+          <w:highlight w:val="yellow"/>
+        </w:rPr>
+        <w:t>starter_prob</w:t>
+      </w:r>
+      <w:proofErr w:type="spellEnd"/>
+      <w:r>
+        <w:rPr>
+          <w:highlight w:val="yellow"/>
+        </w:rPr>
+        <w:t xml:space="preserve"> = 1.0</w:t>
+      </w:r>
+    </w:p>
+    <w:p>
+      <w:pPr>
+        <w:ind w:left="360"/>
+        <w:rPr>
+          <w:highlight w:val="yellow"/>
+        </w:rPr>
+      </w:pPr>
+      <w:r>
+        <w:rPr>
+          <w:highlight w:val="yellow"/>
+        </w:rPr>
+        <w:t xml:space="preserve">        ELSE IF </w:t>
+      </w:r>
+      <w:proofErr w:type="spellStart"/>
+      <w:r>
+        <w:rPr>
+          <w:highlight w:val="yellow"/>
+        </w:rPr>
+        <w:t>average_minutes</w:t>
+      </w:r>
+      <w:proofErr w:type="spellEnd"/>
+      <w:r>
+        <w:rPr>
+          <w:highlight w:val="yellow"/>
+        </w:rPr>
+        <w:t xml:space="preserve"> &lt; 45:</w:t>
+      </w:r>
+    </w:p>
+    <w:p>
+      <w:pPr>
+        <w:ind w:left="360"/>
+        <w:rPr>
+          <w:highlight w:val="yellow"/>
+        </w:rPr>
+      </w:pPr>
+      <w:r>
+        <w:rPr>
+          <w:highlight w:val="yellow"/>
+        </w:rPr>
+        <w:t xml:space="preserve">            </w:t>
+      </w:r>
+      <w:proofErr w:type="spellStart"/>
+      <w:r>
+        <w:rPr>
+          <w:highlight w:val="yellow"/>
+        </w:rPr>
+        <w:t>starter_prob</w:t>
+      </w:r>
+      <w:proofErr w:type="spellEnd"/>
+      <w:r>
+        <w:rPr>
+          <w:highlight w:val="yellow"/>
+        </w:rPr>
+        <w:t xml:space="preserve"> = </w:t>
+      </w:r>
+      <w:proofErr w:type="gramStart"/>
+      <w:r>
+        <w:rPr>
+          <w:highlight w:val="yellow"/>
+        </w:rPr>
+        <w:t>0.25  #</w:t>
+      </w:r>
+      <w:proofErr w:type="gramEnd"/>
+      <w:r>
+        <w:rPr>
+          <w:highlight w:val="yellow"/>
+        </w:rPr>
+        <w:t xml:space="preserve"> High risk of benching</w:t>
+      </w:r>
+    </w:p>
+    <w:p>
+      <w:pPr>
+        <w:ind w:left="360"/>
+        <w:rPr>
+          <w:highlight w:val="yellow"/>
+        </w:rPr>
+      </w:pPr>
+      <w:r>
+        <w:rPr>
+          <w:highlight w:val="yellow"/>
+        </w:rPr>
+        <w:t xml:space="preserve">        # Rule B: Fixture Difficulty Multiplier</w:t>
+      </w:r>
+    </w:p>
+    <w:p>
+      <w:pPr>
+        <w:ind w:left="360"/>
+        <w:rPr>
+          <w:highlight w:val="yellow"/>
+        </w:rPr>
+      </w:pPr>
+      <w:r>
+        <w:rPr>
+          <w:highlight w:val="yellow"/>
+        </w:rPr>
+        <w:t xml:space="preserve">        difficulty = </w:t>
+      </w:r>
+      <w:proofErr w:type="spellStart"/>
+      <w:r>
+        <w:rPr>
+          <w:highlight w:val="yellow"/>
+        </w:rPr>
+        <w:t>get_opponent_difficulty</w:t>
+      </w:r>
+      <w:proofErr w:type="spellEnd"/>
+      <w:r>
+        <w:rPr>
+          <w:highlight w:val="yellow"/>
+        </w:rPr>
+        <w:t>(</w:t>
+      </w:r>
+      <w:proofErr w:type="spellStart"/>
+      <w:proofErr w:type="gramStart"/>
+      <w:r>
+        <w:rPr>
+          <w:highlight w:val="yellow"/>
+        </w:rPr>
+        <w:t>player.next</w:t>
+      </w:r>
+      <w:proofErr w:type="gramEnd"/>
+      <w:r>
+        <w:rPr>
+          <w:highlight w:val="yellow"/>
+        </w:rPr>
+        <w:t>_match</w:t>
+      </w:r>
+      <w:proofErr w:type="spellEnd"/>
+      <w:r>
+        <w:rPr>
+          <w:highlight w:val="yellow"/>
+        </w:rPr>
+        <w:t>)</w:t>
+      </w:r>
+    </w:p>
+    <w:p>
+      <w:pPr>
+        <w:ind w:left="360"/>
+        <w:rPr>
+          <w:highlight w:val="yellow"/>
+        </w:rPr>
+      </w:pPr>
+      <w:r>
+        <w:rPr>
+          <w:highlight w:val="yellow"/>
+        </w:rPr>
+        <w:t xml:space="preserve">        IF difficulty == 1 (Easy):</w:t>
+      </w:r>
+    </w:p>
+    <w:p>
+      <w:pPr>
+        <w:ind w:left="360"/>
+        <w:rPr>
+          <w:highlight w:val="yellow"/>
+        </w:rPr>
+      </w:pPr>
+      <w:r>
+        <w:rPr>
+          <w:highlight w:val="yellow"/>
+        </w:rPr>
+        <w:t xml:space="preserve">            </w:t>
+      </w:r>
+      <w:proofErr w:type="spellStart"/>
+      <w:r>
+        <w:rPr>
+          <w:highlight w:val="yellow"/>
+        </w:rPr>
+        <w:t>fixture_multiplier</w:t>
+      </w:r>
+      <w:proofErr w:type="spellEnd"/>
+      <w:r>
+        <w:rPr>
+          <w:highlight w:val="yellow"/>
+        </w:rPr>
+        <w:t xml:space="preserve"> = 1.35</w:t>
+      </w:r>
+    </w:p>
+    <w:p>
+      <w:pPr>
+        <w:ind w:left="360"/>
+        <w:rPr>
+          <w:highlight w:val="yellow"/>
+        </w:rPr>
+      </w:pPr>
+      <w:r>
+        <w:rPr>
+          <w:highlight w:val="yellow"/>
+        </w:rPr>
+        <w:t xml:space="preserve">        ELSE IF difficulty == 5 (Hard):</w:t>
+      </w:r>
+    </w:p>
+    <w:p>
+      <w:pPr>
+        <w:ind w:left="360"/>
+        <w:rPr>
+          <w:highlight w:val="yellow"/>
+        </w:rPr>
+      </w:pPr>
+      <w:r>
+        <w:rPr>
+          <w:highlight w:val="yellow"/>
+        </w:rPr>
+        <w:t xml:space="preserve">            </w:t>
+      </w:r>
+      <w:proofErr w:type="spellStart"/>
+      <w:r>
+        <w:rPr>
+          <w:highlight w:val="yellow"/>
+        </w:rPr>
+        <w:t>fixture_multiplier</w:t>
+      </w:r>
+      <w:proofErr w:type="spellEnd"/>
+      <w:r>
+        <w:rPr>
+          <w:highlight w:val="yellow"/>
+        </w:rPr>
+        <w:t xml:space="preserve"> = 0.70</w:t>
+      </w:r>
+    </w:p>
+    <w:p>
+      <w:pPr>
+        <w:ind w:left="360"/>
+        <w:rPr>
+          <w:highlight w:val="yellow"/>
+        </w:rPr>
+      </w:pPr>
+      <w:r>
+        <w:rPr>
+          <w:highlight w:val="yellow"/>
+        </w:rPr>
         <w:lastRenderedPageBreak/>
-        <w:t>Feature Engineering (Form and Lag)</w:t>
-      </w:r>
-      <w:bookmarkEnd w:id="11"/>
-    </w:p>
-    <w:p/>
+        <w:t xml:space="preserve">        # Rule C: The "Big Club Tax" (Bias Correction)</w:t>
+      </w:r>
+    </w:p>
     <w:p>
       <w:pPr>
         <w:ind w:left="360"/>
-      </w:pPr>
-      <w:r>
-        <w:t xml:space="preserve">A new feature called “Player Form” was engineered, to capture trends where often the raw statistics usually fail. </w:t>
-      </w:r>
-    </w:p>
-    <w:p>
-      <w:pPr>
-        <w:pStyle w:val="ListParagraph"/>
-        <w:numPr>
-          <w:ilvl w:val="0"/>
-          <w:numId w:val="3"/>
-        </w:numPr>
-      </w:pPr>
-      <w:r>
-        <w:t>Techique: The Rolling Average of the ICT Index over the previous 3 games.</w:t>
-      </w:r>
-    </w:p>
-    <w:p>
-      <w:pPr>
-        <w:pStyle w:val="ListParagraph"/>
-        <w:numPr>
-          <w:ilvl w:val="0"/>
-          <w:numId w:val="3"/>
-        </w:numPr>
-      </w:pPr>
-      <w:r>
-        <w:t>The Shift (</w:t>
-      </w:r>
-      <w:r>
-        <w:t>Leakage Prevention</w:t>
-      </w:r>
-      <w:r>
-        <w:t xml:space="preserve">): </w:t>
-      </w:r>
-      <w:r>
-        <w:t>a crucial step taken on a time-series prediction, preventing Data Leakage</w:t>
-      </w:r>
-      <w:r>
-        <w:t xml:space="preserve"> – the error of using future information to predict the past </w:t>
-      </w:r>
-      <w:sdt>
-        <w:sdtPr>
-          <w:id w:val="660655015"/>
-          <w:citation/>
-        </w:sdtPr>
-        <w:sdtContent>
-          <w:r>
-            <w:fldChar w:fldCharType="begin"/>
-          </w:r>
-          <w:r>
-            <w:instrText xml:space="preserve">CITATION Sha \l 2057 </w:instrText>
-          </w:r>
-          <w:r>
-            <w:fldChar w:fldCharType="separate"/>
-          </w:r>
-          <w:r>
-            <w:rPr>
-              <w:noProof/>
-            </w:rPr>
-            <w:t>(Shachar Kaufman, Saharon Rosset, &amp; Claudia Perlich, 2011)</w:t>
-          </w:r>
-          <w:r>
-            <w:fldChar w:fldCharType="end"/>
-          </w:r>
-        </w:sdtContent>
-      </w:sdt>
-      <w:r>
-        <w:t>. By shifting the rolling average down by one row, which ensures that the model used past data game weeks 1-3 to predict the future performance game week 4, simulating a real-world scenario.</w:t>
+        <w:rPr>
+          <w:highlight w:val="yellow"/>
+        </w:rPr>
+      </w:pPr>
+      <w:r>
+        <w:rPr>
+          <w:highlight w:val="yellow"/>
+        </w:rPr>
+        <w:t xml:space="preserve">        </w:t>
+      </w:r>
+      <w:proofErr w:type="spellStart"/>
+      <w:r>
+        <w:rPr>
+          <w:highlight w:val="yellow"/>
+        </w:rPr>
+        <w:t>rotation_penalty</w:t>
+      </w:r>
+      <w:proofErr w:type="spellEnd"/>
+      <w:r>
+        <w:rPr>
+          <w:highlight w:val="yellow"/>
+        </w:rPr>
+        <w:t xml:space="preserve"> = 1.0</w:t>
+      </w:r>
+    </w:p>
+    <w:p>
+      <w:pPr>
+        <w:ind w:left="360"/>
+        <w:rPr>
+          <w:highlight w:val="yellow"/>
+        </w:rPr>
+      </w:pPr>
+      <w:r>
+        <w:rPr>
+          <w:highlight w:val="yellow"/>
+        </w:rPr>
+        <w:t xml:space="preserve">        IF </w:t>
+      </w:r>
+      <w:proofErr w:type="spellStart"/>
+      <w:proofErr w:type="gramStart"/>
+      <w:r>
+        <w:rPr>
+          <w:highlight w:val="yellow"/>
+        </w:rPr>
+        <w:t>player.team</w:t>
+      </w:r>
+      <w:proofErr w:type="spellEnd"/>
+      <w:proofErr w:type="gramEnd"/>
+      <w:r>
+        <w:rPr>
+          <w:highlight w:val="yellow"/>
+        </w:rPr>
+        <w:t xml:space="preserve"> IN ["MCI", "ARS", "LIV"] AND </w:t>
+      </w:r>
+      <w:proofErr w:type="spellStart"/>
+      <w:proofErr w:type="gramStart"/>
+      <w:r>
+        <w:rPr>
+          <w:highlight w:val="yellow"/>
+        </w:rPr>
+        <w:t>player.price</w:t>
+      </w:r>
+      <w:proofErr w:type="spellEnd"/>
+      <w:proofErr w:type="gramEnd"/>
+      <w:r>
+        <w:rPr>
+          <w:highlight w:val="yellow"/>
+        </w:rPr>
+        <w:t xml:space="preserve"> &lt; 9.0:</w:t>
+      </w:r>
+    </w:p>
+    <w:p>
+      <w:pPr>
+        <w:ind w:left="360"/>
+        <w:rPr>
+          <w:highlight w:val="yellow"/>
+        </w:rPr>
+      </w:pPr>
+      <w:r>
+        <w:rPr>
+          <w:highlight w:val="yellow"/>
+        </w:rPr>
+        <w:t xml:space="preserve">            </w:t>
+      </w:r>
+      <w:proofErr w:type="spellStart"/>
+      <w:r>
+        <w:rPr>
+          <w:highlight w:val="yellow"/>
+        </w:rPr>
+        <w:t>rotation_penalty</w:t>
+      </w:r>
+      <w:proofErr w:type="spellEnd"/>
+      <w:r>
+        <w:rPr>
+          <w:highlight w:val="yellow"/>
+        </w:rPr>
+        <w:t xml:space="preserve"> = </w:t>
+      </w:r>
+      <w:proofErr w:type="gramStart"/>
+      <w:r>
+        <w:rPr>
+          <w:highlight w:val="yellow"/>
+        </w:rPr>
+        <w:t>0.75  #</w:t>
+      </w:r>
+      <w:proofErr w:type="gramEnd"/>
+      <w:r>
+        <w:rPr>
+          <w:highlight w:val="yellow"/>
+        </w:rPr>
+        <w:t xml:space="preserve"> 25% penalty for non-premium assets</w:t>
+      </w:r>
+    </w:p>
+    <w:p>
+      <w:pPr>
+        <w:ind w:left="360"/>
+        <w:rPr>
+          <w:highlight w:val="yellow"/>
+        </w:rPr>
+      </w:pPr>
+      <w:r>
+        <w:rPr>
+          <w:highlight w:val="yellow"/>
+        </w:rPr>
+        <w:t xml:space="preserve">        # Step 3: Final Calculation</w:t>
+      </w:r>
+    </w:p>
+    <w:p>
+      <w:pPr>
+        <w:ind w:left="360"/>
+        <w:rPr>
+          <w:highlight w:val="yellow"/>
+        </w:rPr>
+      </w:pPr>
+      <w:r>
+        <w:rPr>
+          <w:highlight w:val="yellow"/>
+        </w:rPr>
+        <w:t xml:space="preserve">        </w:t>
+      </w:r>
+      <w:proofErr w:type="spellStart"/>
+      <w:r>
+        <w:rPr>
+          <w:highlight w:val="yellow"/>
+        </w:rPr>
+        <w:t>final_prediction</w:t>
+      </w:r>
+      <w:proofErr w:type="spellEnd"/>
+      <w:r>
+        <w:rPr>
+          <w:highlight w:val="yellow"/>
+        </w:rPr>
+        <w:t xml:space="preserve"> = </w:t>
+      </w:r>
+      <w:proofErr w:type="spellStart"/>
+      <w:r>
+        <w:rPr>
+          <w:highlight w:val="yellow"/>
+        </w:rPr>
+        <w:t>raw_xp</w:t>
+      </w:r>
+      <w:proofErr w:type="spellEnd"/>
+      <w:r>
+        <w:rPr>
+          <w:highlight w:val="yellow"/>
+        </w:rPr>
+        <w:t xml:space="preserve"> * </w:t>
+      </w:r>
+      <w:proofErr w:type="spellStart"/>
+      <w:r>
+        <w:rPr>
+          <w:highlight w:val="yellow"/>
+        </w:rPr>
+        <w:t>fixture_multiplier</w:t>
+      </w:r>
+      <w:proofErr w:type="spellEnd"/>
+      <w:r>
+        <w:rPr>
+          <w:highlight w:val="yellow"/>
+        </w:rPr>
+        <w:t xml:space="preserve"> * </w:t>
+      </w:r>
+      <w:proofErr w:type="spellStart"/>
+      <w:r>
+        <w:rPr>
+          <w:highlight w:val="yellow"/>
+        </w:rPr>
+        <w:t>rotation_penalty</w:t>
+      </w:r>
+      <w:proofErr w:type="spellEnd"/>
+      <w:r>
+        <w:rPr>
+          <w:highlight w:val="yellow"/>
+        </w:rPr>
+        <w:t xml:space="preserve"> * </w:t>
+      </w:r>
+      <w:proofErr w:type="spellStart"/>
+      <w:r>
+        <w:rPr>
+          <w:highlight w:val="yellow"/>
+        </w:rPr>
+        <w:t>starter_prob</w:t>
+      </w:r>
+      <w:proofErr w:type="spellEnd"/>
+    </w:p>
+    <w:p>
+      <w:pPr>
+        <w:ind w:left="360"/>
+        <w:rPr>
+          <w:highlight w:val="yellow"/>
+        </w:rPr>
+      </w:pPr>
+      <w:r>
+        <w:rPr>
+          <w:highlight w:val="yellow"/>
+        </w:rPr>
+        <w:t xml:space="preserve">        # Step 4: Safety Clamp</w:t>
+      </w:r>
+    </w:p>
+    <w:p>
+      <w:pPr>
+        <w:ind w:left="360"/>
+        <w:rPr>
+          <w:highlight w:val="yellow"/>
+        </w:rPr>
+      </w:pPr>
+      <w:r>
+        <w:rPr>
+          <w:highlight w:val="yellow"/>
+        </w:rPr>
+        <w:t xml:space="preserve">        </w:t>
+      </w:r>
+      <w:proofErr w:type="spellStart"/>
+      <w:r>
+        <w:rPr>
+          <w:highlight w:val="yellow"/>
+        </w:rPr>
+        <w:t>final_prediction</w:t>
+      </w:r>
+      <w:proofErr w:type="spellEnd"/>
+      <w:r>
+        <w:rPr>
+          <w:highlight w:val="yellow"/>
+        </w:rPr>
+        <w:t xml:space="preserve"> = </w:t>
+      </w:r>
+      <w:proofErr w:type="gramStart"/>
+      <w:r>
+        <w:rPr>
+          <w:highlight w:val="yellow"/>
+        </w:rPr>
+        <w:t>CLAMP(</w:t>
+      </w:r>
+      <w:proofErr w:type="spellStart"/>
+      <w:proofErr w:type="gramEnd"/>
+      <w:r>
+        <w:rPr>
+          <w:highlight w:val="yellow"/>
+        </w:rPr>
+        <w:t>final_prediction</w:t>
+      </w:r>
+      <w:proofErr w:type="spellEnd"/>
+      <w:r>
+        <w:rPr>
+          <w:highlight w:val="yellow"/>
+        </w:rPr>
+        <w:t>, MIN=0, MAX=18)</w:t>
+      </w:r>
+    </w:p>
+    <w:p>
+      <w:pPr>
+        <w:ind w:left="360"/>
+        <w:rPr>
+          <w:highlight w:val="yellow"/>
+        </w:rPr>
+      </w:pPr>
+      <w:r>
+        <w:rPr>
+          <w:highlight w:val="yellow"/>
+        </w:rPr>
+        <w:t xml:space="preserve">    RETURN </w:t>
+      </w:r>
+      <w:proofErr w:type="spellStart"/>
+      <w:r>
+        <w:rPr>
+          <w:highlight w:val="yellow"/>
+        </w:rPr>
+        <w:t>sorted_predictions</w:t>
+      </w:r>
+      <w:proofErr w:type="spellEnd"/>
+    </w:p>
+    <w:p>
+      <w:pPr>
+        <w:ind w:left="360"/>
+      </w:pPr>
+      <w:r>
+        <w:rPr>
+          <w:highlight w:val="yellow"/>
+        </w:rPr>
+        <w:t>END FUNCTION</w:t>
       </w:r>
     </w:p>
     <w:p/>
@@ -4510,158 +5901,29 @@
           <w:numId w:val="1"/>
         </w:numPr>
       </w:pPr>
-      <w:bookmarkStart w:id="12" w:name="_Toc216889944"/>
-      <w:r>
-        <w:t>Validation Strategy (Temporal Split)</w:t>
-      </w:r>
-      <w:bookmarkEnd w:id="12"/>
-    </w:p>
-    <w:p/>
-    <w:p>
-      <w:pPr>
-        <w:ind w:left="360"/>
-      </w:pPr>
-      <w:r>
-        <w:t xml:space="preserve">The standard random train test split will be inappropriate for time series data because it would allow the model to cheat by training on future games. </w:t>
-      </w:r>
-      <w:r>
-        <w:t>Instead,</w:t>
-      </w:r>
-      <w:r>
-        <w:t xml:space="preserve"> </w:t>
-      </w:r>
-      <w:r>
-        <w:t xml:space="preserve">strict </w:t>
-      </w:r>
-      <w:r>
-        <w:t>a Temporal Split was created</w:t>
-      </w:r>
-      <w:r>
-        <w:t xml:space="preserve"> based on </w:t>
-      </w:r>
-      <w:sdt>
-        <w:sdtPr>
-          <w:id w:val="1002400647"/>
-          <w:citation/>
-        </w:sdtPr>
-        <w:sdtContent>
-          <w:r>
-            <w:fldChar w:fldCharType="begin"/>
-          </w:r>
-          <w:r>
-            <w:instrText xml:space="preserve"> CITATION Gar23 \l 2057 </w:instrText>
-          </w:r>
-          <w:r>
-            <w:fldChar w:fldCharType="separate"/>
-          </w:r>
-          <w:r>
-            <w:rPr>
-              <w:noProof/>
-            </w:rPr>
-            <w:t>(Gareth James • Daniela Witten • Trevor Hastie, 2023)</w:t>
-          </w:r>
-          <w:r>
-            <w:fldChar w:fldCharType="end"/>
-          </w:r>
-        </w:sdtContent>
-      </w:sdt>
-      <w:r>
-        <w:t xml:space="preserve">: </w:t>
-      </w:r>
-    </w:p>
-    <w:p>
-      <w:pPr>
-        <w:pStyle w:val="ListParagraph"/>
-        <w:numPr>
-          <w:ilvl w:val="0"/>
-          <w:numId w:val="4"/>
-        </w:numPr>
-      </w:pPr>
-      <w:r>
-        <w:t>Training Set</w:t>
-      </w:r>
-      <w:r>
-        <w:t xml:space="preserve"> (X train)</w:t>
-      </w:r>
-      <w:r>
-        <w:t xml:space="preserve">: Seasons 2021/22, </w:t>
-      </w:r>
-      <w:r>
-        <w:t>2022/23, 2023/24, and 2024/25.</w:t>
-      </w:r>
-    </w:p>
-    <w:p>
-      <w:pPr>
-        <w:pStyle w:val="ListParagraph"/>
-        <w:numPr>
-          <w:ilvl w:val="0"/>
-          <w:numId w:val="4"/>
-        </w:numPr>
-      </w:pPr>
-      <w:r>
-        <w:t>Test Set</w:t>
-      </w:r>
-      <w:r>
-        <w:t xml:space="preserve"> (X test)</w:t>
-      </w:r>
-      <w:r>
-        <w:t>: The current 2025/26 Season.</w:t>
-      </w:r>
-    </w:p>
-    <w:p/>
-    <w:p>
-      <w:pPr>
-        <w:pStyle w:val="Heading2"/>
-        <w:numPr>
-          <w:ilvl w:val="1"/>
-          <w:numId w:val="1"/>
-        </w:numPr>
-      </w:pPr>
-      <w:bookmarkStart w:id="13" w:name="_Toc216889945"/>
-      <w:r>
-        <w:t>Evidence and Preliminary Analysis</w:t>
+      <w:bookmarkStart w:id="13" w:name="_Toc219895148"/>
+      <w:r>
+        <w:t>Diagrammatical Representation</w:t>
       </w:r>
       <w:bookmarkEnd w:id="13"/>
-      <w:r>
-        <w:t xml:space="preserve"> </w:t>
-      </w:r>
-    </w:p>
-    <w:p/>
-    <w:p>
-      <w:pPr>
-        <w:ind w:left="360"/>
-      </w:pPr>
-      <w:r>
-        <w:t xml:space="preserve">The below visualizations which </w:t>
-      </w:r>
-      <w:proofErr w:type="gramStart"/>
-      <w:r>
-        <w:t>was</w:t>
-      </w:r>
-      <w:proofErr w:type="gramEnd"/>
-      <w:r>
-        <w:t xml:space="preserve"> generated form the cleaned dataset confirm the viability of the Linear Regression approach.</w:t>
-      </w:r>
-    </w:p>
-    <w:p>
-      <w:pPr>
-        <w:ind w:left="360"/>
-      </w:pPr>
-    </w:p>
-    <w:p>
-      <w:pPr>
-        <w:ind w:left="360"/>
+    </w:p>
+    <w:p>
+      <w:pPr>
+        <w:ind w:left="1440" w:firstLine="720"/>
+        <w:rPr>
+          <w:lang w:val="en-US"/>
+        </w:rPr>
       </w:pPr>
       <w:r>
         <w:rPr>
           <w:noProof/>
-        </w:rPr>
-        <w:lastRenderedPageBreak/>
+          <w:lang w:val="en-US"/>
+        </w:rPr>
         <w:drawing>
-          <wp:inline distT="0" distB="0" distL="0" distR="0" wp14:anchorId="789F2307" wp14:editId="051EF49E">
-            <wp:extent cx="5941060" cy="4455795"/>
-            <wp:effectExtent l="0" t="0" r="2540" b="1905"/>
-            <wp:docPr id="1374921" name="Picture 1"/>
+          <wp:inline distT="0" distB="0" distL="0" distR="0" wp14:anchorId="6F44C4FE" wp14:editId="67AAD966">
+            <wp:extent cx="2514600" cy="4443271"/>
+            <wp:effectExtent l="0" t="0" r="0" b="0"/>
+            <wp:docPr id="1276686669" name="Picture 2" descr="A diagram of a process&#10;&#10;AI-generated content may be incorrect."/>
             <wp:cNvGraphicFramePr>
               <a:graphicFrameLocks xmlns:a="http://schemas.openxmlformats.org/drawingml/2006/main" noChangeAspect="1"/>
             </wp:cNvGraphicFramePr>
@@ -4669,13 +5931,13 @@
               <a:graphicData uri="http://schemas.openxmlformats.org/drawingml/2006/picture">
                 <pic:pic xmlns:pic="http://schemas.openxmlformats.org/drawingml/2006/picture">
                   <pic:nvPicPr>
-                    <pic:cNvPr id="0" name="Picture 1"/>
+                    <pic:cNvPr id="1276686669" name="Picture 2" descr="A diagram of a process&#10;&#10;AI-generated content may be incorrect."/>
                     <pic:cNvPicPr>
                       <a:picLocks noChangeAspect="1" noChangeArrowheads="1"/>
                     </pic:cNvPicPr>
                   </pic:nvPicPr>
                   <pic:blipFill>
-                    <a:blip r:embed="rId11">
+                    <a:blip r:embed="rId11" cstate="print">
                       <a:extLst>
                         <a:ext uri="{28A0092B-C50C-407E-A947-70E740481C1C}">
                           <a14:useLocalDpi xmlns:a14="http://schemas.microsoft.com/office/drawing/2010/main" val="0"/>
@@ -4690,7 +5952,7 @@
                   <pic:spPr bwMode="auto">
                     <a:xfrm>
                       <a:off x="0" y="0"/>
-                      <a:ext cx="5941060" cy="4455795"/>
+                      <a:ext cx="2524126" cy="4460103"/>
                     </a:xfrm>
                     <a:prstGeom prst="rect">
                       <a:avLst/>
@@ -4710,95 +5972,282 @@
     <w:p>
       <w:pPr>
         <w:pStyle w:val="Caption"/>
-        <w:rPr>
-          <w:color w:val="000000" w:themeColor="text1"/>
-        </w:rPr>
-      </w:pPr>
-      <w:r>
-        <w:tab/>
-      </w:r>
-      <w:bookmarkStart w:id="14" w:name="_Toc216889969"/>
-      <w:r>
-        <w:rPr>
-          <w:color w:val="000000" w:themeColor="text1"/>
-        </w:rPr>
+        <w:ind w:left="1440" w:firstLine="720"/>
+      </w:pPr>
+      <w:bookmarkStart w:id="14" w:name="_Toc219895156"/>
+      <w:r>
         <w:t xml:space="preserve">Figure </w:t>
       </w:r>
-      <w:r>
-        <w:rPr>
-          <w:color w:val="000000" w:themeColor="text1"/>
-        </w:rPr>
-        <w:fldChar w:fldCharType="begin"/>
-      </w:r>
-      <w:r>
-        <w:rPr>
-          <w:color w:val="000000" w:themeColor="text1"/>
-        </w:rPr>
-        <w:instrText xml:space="preserve"> SEQ Figure \* ARABIC </w:instrText>
-      </w:r>
-      <w:r>
-        <w:rPr>
-          <w:color w:val="000000" w:themeColor="text1"/>
-        </w:rPr>
-        <w:fldChar w:fldCharType="separate"/>
-      </w:r>
+      <w:fldSimple w:instr=" SEQ Figure \* ARABIC ">
+        <w:r>
+          <w:rPr>
+            <w:noProof/>
+          </w:rPr>
+          <w:t>1</w:t>
+        </w:r>
+      </w:fldSimple>
+      <w:r>
+        <w:t xml:space="preserve">: </w:t>
+      </w:r>
+      <w:r>
+        <w:t>System Flowchart illustrating the Hybrid Architecture pipeline.</w:t>
+      </w:r>
+      <w:bookmarkEnd w:id="14"/>
+    </w:p>
+    <w:p>
+      <w:pPr>
+        <w:pStyle w:val="Heading2"/>
+        <w:numPr>
+          <w:ilvl w:val="1"/>
+          <w:numId w:val="1"/>
+        </w:numPr>
+      </w:pPr>
+      <w:bookmarkStart w:id="15" w:name="_Toc219895149"/>
+      <w:r>
+        <w:lastRenderedPageBreak/>
+        <w:t>Development Process</w:t>
+      </w:r>
+      <w:bookmarkEnd w:id="15"/>
+    </w:p>
+    <w:p/>
+    <w:p>
+      <w:pPr>
+        <w:ind w:left="360" w:firstLine="360"/>
+      </w:pPr>
+      <w:r>
+        <w:t>Using an Agile Methodology, which allowed for iterative improvements</w:t>
+      </w:r>
+      <w:r>
+        <w:t xml:space="preserve">, based on the testing results. </w:t>
+      </w:r>
+    </w:p>
+    <w:p>
+      <w:pPr>
+        <w:ind w:left="360"/>
+      </w:pPr>
+      <w:r>
+        <w:t>Tools &amp; Technologies:</w:t>
+      </w:r>
+    </w:p>
+    <w:p>
+      <w:pPr>
+        <w:pStyle w:val="ListParagraph"/>
+        <w:numPr>
+          <w:ilvl w:val="1"/>
+          <w:numId w:val="5"/>
+        </w:numPr>
+      </w:pPr>
+      <w:r>
+        <w:rPr>
+          <w:b/>
+          <w:bCs/>
+        </w:rPr>
+        <w:t>Python</w:t>
+      </w:r>
+      <w:r>
+        <w:t>: The Core language for programming</w:t>
+      </w:r>
+    </w:p>
+    <w:p>
+      <w:pPr>
+        <w:pStyle w:val="ListParagraph"/>
+        <w:numPr>
+          <w:ilvl w:val="1"/>
+          <w:numId w:val="5"/>
+        </w:numPr>
+      </w:pPr>
+      <w:r>
+        <w:rPr>
+          <w:b/>
+          <w:bCs/>
+        </w:rPr>
+        <w:t>Pandas</w:t>
+      </w:r>
+      <w:r>
+        <w:t xml:space="preserve">: </w:t>
+      </w:r>
+      <w:r>
+        <w:t>For complex data manipulation</w:t>
+      </w:r>
+    </w:p>
+    <w:p>
+      <w:pPr>
+        <w:pStyle w:val="ListParagraph"/>
+        <w:numPr>
+          <w:ilvl w:val="1"/>
+          <w:numId w:val="5"/>
+        </w:numPr>
+      </w:pPr>
+      <w:r>
+        <w:rPr>
+          <w:b/>
+          <w:bCs/>
+        </w:rPr>
+        <w:t>Scikit-Learn</w:t>
+      </w:r>
+      <w:r>
+        <w:t>:</w:t>
+      </w:r>
+      <w:r>
+        <w:t xml:space="preserve"> Training the Linear Regression Model.</w:t>
+      </w:r>
+    </w:p>
+    <w:p>
+      <w:pPr>
+        <w:pStyle w:val="ListParagraph"/>
+        <w:numPr>
+          <w:ilvl w:val="1"/>
+          <w:numId w:val="5"/>
+        </w:numPr>
+      </w:pPr>
+      <w:proofErr w:type="spellStart"/>
+      <w:r>
+        <w:rPr>
+          <w:b/>
+          <w:bCs/>
+        </w:rPr>
+        <w:t>Streamlit</w:t>
+      </w:r>
+      <w:proofErr w:type="spellEnd"/>
+      <w:r>
+        <w:t>:</w:t>
+      </w:r>
+      <w:r>
+        <w:t xml:space="preserve"> For building the interactive interface</w:t>
+      </w:r>
+    </w:p>
+    <w:p>
+      <w:pPr>
+        <w:pStyle w:val="ListParagraph"/>
+        <w:numPr>
+          <w:ilvl w:val="1"/>
+          <w:numId w:val="5"/>
+        </w:numPr>
+      </w:pPr>
+      <w:proofErr w:type="spellStart"/>
+      <w:r>
+        <w:rPr>
+          <w:b/>
+          <w:bCs/>
+        </w:rPr>
+        <w:t>Joblib</w:t>
+      </w:r>
+      <w:proofErr w:type="spellEnd"/>
+      <w:r>
+        <w:t xml:space="preserve">: For creating </w:t>
+      </w:r>
+      <w:proofErr w:type="gramStart"/>
+      <w:r>
+        <w:t>the .</w:t>
+      </w:r>
+      <w:proofErr w:type="spellStart"/>
+      <w:r>
+        <w:t>pkl</w:t>
+      </w:r>
+      <w:proofErr w:type="spellEnd"/>
+      <w:proofErr w:type="gramEnd"/>
+      <w:r>
+        <w:t xml:space="preserve"> from the training model for instant loading.</w:t>
+      </w:r>
+    </w:p>
+    <w:p>
+      <w:pPr>
+        <w:pStyle w:val="ListParagraph"/>
+        <w:numPr>
+          <w:ilvl w:val="1"/>
+          <w:numId w:val="5"/>
+        </w:numPr>
+      </w:pPr>
+      <w:r>
+        <w:rPr>
+          <w:b/>
+          <w:bCs/>
+        </w:rPr>
+        <w:t>VS Code</w:t>
+      </w:r>
+      <w:r>
+        <w:t>:</w:t>
+      </w:r>
+      <w:r>
+        <w:t xml:space="preserve"> Integrated Development Environment.</w:t>
+      </w:r>
+    </w:p>
+    <w:p/>
+    <w:p>
+      <w:pPr>
+        <w:pStyle w:val="Heading2"/>
+        <w:numPr>
+          <w:ilvl w:val="1"/>
+          <w:numId w:val="1"/>
+        </w:numPr>
+      </w:pPr>
+      <w:bookmarkStart w:id="16" w:name="_Toc219895150"/>
+      <w:r>
+        <w:t>Achieved Results</w:t>
+      </w:r>
+      <w:bookmarkEnd w:id="16"/>
+      <w:r>
+        <w:t xml:space="preserve"> </w:t>
+      </w:r>
+    </w:p>
+    <w:p/>
+    <w:p>
+      <w:pPr>
+        <w:ind w:left="360"/>
+      </w:pPr>
+      <w:r>
+        <w:t xml:space="preserve">Successfully achieved live, interactive predictions. </w:t>
+      </w:r>
+    </w:p>
+    <w:p>
+      <w:pPr>
+        <w:pStyle w:val="ListParagraph"/>
+        <w:numPr>
+          <w:ilvl w:val="0"/>
+          <w:numId w:val="5"/>
+        </w:numPr>
+      </w:pPr>
+      <w:r>
+        <w:t>Accuracy: For the Game week 22 the model was able to achieve an RMSE of ~</w:t>
+      </w:r>
+      <w:r>
+        <w:t>1.94</w:t>
+      </w:r>
+      <w:r>
+        <w:t>.</w:t>
+      </w:r>
+    </w:p>
+    <w:p>
+      <w:pPr>
+        <w:pStyle w:val="ListParagraph"/>
+        <w:numPr>
+          <w:ilvl w:val="0"/>
+          <w:numId w:val="5"/>
+        </w:numPr>
+      </w:pPr>
+      <w:r>
+        <w:t>Validation: The “</w:t>
+      </w:r>
+      <w:proofErr w:type="spellStart"/>
+      <w:r>
+        <w:t>Backtest</w:t>
+      </w:r>
+      <w:proofErr w:type="spellEnd"/>
+      <w:r>
+        <w:t xml:space="preserve">” feature was correctly predicting low scores for rotated players like Rico Lewis. </w:t>
+      </w:r>
+    </w:p>
+    <w:p/>
+    <w:p>
       <w:r>
         <w:rPr>
           <w:noProof/>
-          <w:color w:val="000000" w:themeColor="text1"/>
-        </w:rPr>
-        <w:t>1</w:t>
-      </w:r>
-      <w:r>
-        <w:rPr>
-          <w:color w:val="000000" w:themeColor="text1"/>
-        </w:rPr>
-        <w:fldChar w:fldCharType="end"/>
-      </w:r>
-      <w:r>
-        <w:rPr>
-          <w:color w:val="000000" w:themeColor="text1"/>
-        </w:rPr>
-        <w:t>: Feature Correlation Heatmap</w:t>
-      </w:r>
-      <w:bookmarkEnd w:id="14"/>
-    </w:p>
-    <w:p>
-      <w:pPr>
-        <w:ind w:left="720"/>
-      </w:pPr>
-      <w:r>
-        <w:t xml:space="preserve">The heatmap demonstrates </w:t>
-      </w:r>
-      <w:r>
-        <w:t>that there is a</w:t>
-      </w:r>
-      <w:r>
-        <w:t xml:space="preserve"> strong positive correlation between ICT Index and Total Points</w:t>
-      </w:r>
-      <w:r>
-        <w:t xml:space="preserve">. This statistical evidence validates the selection of ICT Index as a primary predictor variable. </w:t>
-      </w:r>
-    </w:p>
-    <w:p>
-      <w:pPr>
-        <w:ind w:left="360"/>
-      </w:pPr>
-    </w:p>
-    <w:p>
-      <w:pPr>
-        <w:ind w:left="360"/>
-      </w:pPr>
-      <w:r>
-        <w:rPr>
-          <w:noProof/>
-        </w:rPr>
-        <w:lastRenderedPageBreak/>
+        </w:rPr>
         <w:drawing>
-          <wp:inline distT="0" distB="0" distL="0" distR="0" wp14:anchorId="166AF2D5" wp14:editId="510C2F22">
-            <wp:extent cx="5946140" cy="3567430"/>
+          <wp:inline distT="0" distB="0" distL="0" distR="0" wp14:anchorId="1FE049F8" wp14:editId="4BB8741B">
+            <wp:extent cx="5943600" cy="3228340"/>
             <wp:effectExtent l="0" t="0" r="0" b="0"/>
-            <wp:docPr id="1118338952" name="Picture 2"/>
+            <wp:docPr id="78188543" name="Picture 1" descr="A screenshot of a computer&#10;&#10;AI-generated content may be incorrect."/>
             <wp:cNvGraphicFramePr>
               <a:graphicFrameLocks xmlns:a="http://schemas.openxmlformats.org/drawingml/2006/main" noChangeAspect="1"/>
             </wp:cNvGraphicFramePr>
@@ -4806,13 +6255,78 @@
               <a:graphicData uri="http://schemas.openxmlformats.org/drawingml/2006/picture">
                 <pic:pic xmlns:pic="http://schemas.openxmlformats.org/drawingml/2006/picture">
                   <pic:nvPicPr>
-                    <pic:cNvPr id="0" name="Picture 2"/>
+                    <pic:cNvPr id="78188543" name="Picture 1" descr="A screenshot of a computer&#10;&#10;AI-generated content may be incorrect."/>
+                    <pic:cNvPicPr/>
+                  </pic:nvPicPr>
+                  <pic:blipFill>
+                    <a:blip r:embed="rId12"/>
+                    <a:stretch>
+                      <a:fillRect/>
+                    </a:stretch>
+                  </pic:blipFill>
+                  <pic:spPr>
+                    <a:xfrm>
+                      <a:off x="0" y="0"/>
+                      <a:ext cx="5943600" cy="3228340"/>
+                    </a:xfrm>
+                    <a:prstGeom prst="rect">
+                      <a:avLst/>
+                    </a:prstGeom>
+                  </pic:spPr>
+                </pic:pic>
+              </a:graphicData>
+            </a:graphic>
+          </wp:inline>
+        </w:drawing>
+      </w:r>
+    </w:p>
+    <w:p>
+      <w:pPr>
+        <w:pStyle w:val="Caption"/>
+        <w:ind w:firstLine="360"/>
+      </w:pPr>
+      <w:bookmarkStart w:id="17" w:name="_Toc219895157"/>
+      <w:r>
+        <w:t xml:space="preserve">Figure </w:t>
+      </w:r>
+      <w:fldSimple w:instr=" SEQ Figure \* ARABIC ">
+        <w:r>
+          <w:rPr>
+            <w:noProof/>
+          </w:rPr>
+          <w:t>2</w:t>
+        </w:r>
+      </w:fldSimple>
+      <w:r>
+        <w:t>: The Main Prediction Dashboard showing top 5 Recommended Captains.</w:t>
+      </w:r>
+      <w:bookmarkEnd w:id="17"/>
+    </w:p>
+    <w:p/>
+    <w:p>
+      <w:r>
+        <w:rPr>
+          <w:noProof/>
+        </w:rPr>
+        <w:drawing>
+          <wp:inline distT="0" distB="0" distL="0" distR="0" wp14:anchorId="341EA2EE" wp14:editId="2AF20CBE">
+            <wp:extent cx="5937250" cy="3022600"/>
+            <wp:effectExtent l="0" t="0" r="6350" b="6350"/>
+            <wp:docPr id="771485065" name="Picture 3"/>
+            <wp:cNvGraphicFramePr>
+              <a:graphicFrameLocks xmlns:a="http://schemas.openxmlformats.org/drawingml/2006/main" noChangeAspect="1"/>
+            </wp:cNvGraphicFramePr>
+            <a:graphic xmlns:a="http://schemas.openxmlformats.org/drawingml/2006/main">
+              <a:graphicData uri="http://schemas.openxmlformats.org/drawingml/2006/picture">
+                <pic:pic xmlns:pic="http://schemas.openxmlformats.org/drawingml/2006/picture">
+                  <pic:nvPicPr>
+                    <pic:cNvPr id="0" name="Picture 8"/>
                     <pic:cNvPicPr>
                       <a:picLocks noChangeAspect="1" noChangeArrowheads="1"/>
                     </pic:cNvPicPr>
                   </pic:nvPicPr>
                   <pic:blipFill>
-                    <a:blip r:embed="rId12">
+                    <a:blip r:embed="rId13" cstate="print">
                       <a:extLst>
                         <a:ext uri="{28A0092B-C50C-407E-A947-70E740481C1C}">
                           <a14:useLocalDpi xmlns:a14="http://schemas.microsoft.com/office/drawing/2010/main" val="0"/>
@@ -4827,7 +6341,7 @@
                   <pic:spPr bwMode="auto">
                     <a:xfrm>
                       <a:off x="0" y="0"/>
-                      <a:ext cx="5946140" cy="3567430"/>
+                      <a:ext cx="5937250" cy="3022600"/>
                     </a:xfrm>
                     <a:prstGeom prst="rect">
                       <a:avLst/>
@@ -4851,7 +6365,7 @@
       <w:r>
         <w:tab/>
       </w:r>
-      <w:bookmarkStart w:id="15" w:name="_Toc216889970"/>
+      <w:bookmarkStart w:id="18" w:name="_Toc219895158"/>
       <w:r>
         <w:t xml:space="preserve">Figure </w:t>
       </w:r>
@@ -4860,21 +6374,21 @@
           <w:rPr>
             <w:noProof/>
           </w:rPr>
-          <w:t>2</w:t>
+          <w:t>3</w:t>
         </w:r>
       </w:fldSimple>
       <w:r>
-        <w:t>: Scatter Plot of Form vs. Points</w:t>
-      </w:r>
-      <w:bookmarkEnd w:id="15"/>
-    </w:p>
-    <w:p>
-      <w:pPr>
-        <w:ind w:left="720"/>
-      </w:pPr>
-      <w:r>
-        <w:t>The scatter plot reveals that there is a linear trend where players with a higher ICT Form consistently score high points. Which confirms the engineered Form feature is highly effective.</w:t>
-      </w:r>
+        <w:t xml:space="preserve">: The Historical Validation Interface allowing users to test accuracy on past </w:t>
+      </w:r>
+      <w:proofErr w:type="spellStart"/>
+      <w:r>
+        <w:t>gameweeks</w:t>
+      </w:r>
+      <w:proofErr w:type="spellEnd"/>
+      <w:r>
+        <w:t>.</w:t>
+      </w:r>
+      <w:bookmarkEnd w:id="18"/>
     </w:p>
     <w:p/>
     <w:p>
@@ -4885,13 +6399,12 @@
           <w:numId w:val="1"/>
         </w:numPr>
       </w:pPr>
-      <w:bookmarkStart w:id="16" w:name="_Toc216889946"/>
+      <w:bookmarkStart w:id="19" w:name="_Toc219895151"/>
       <w:r>
         <w:t>Conclusion</w:t>
       </w:r>
-      <w:bookmarkEnd w:id="16"/>
-    </w:p>
-    <w:p/>
+      <w:bookmarkEnd w:id="19"/>
+    </w:p>
     <w:p>
       <w:pPr>
         <w:pStyle w:val="Heading2"/>
@@ -4900,22 +6413,95 @@
           <w:numId w:val="1"/>
         </w:numPr>
       </w:pPr>
-      <w:bookmarkStart w:id="17" w:name="_Toc216889947"/>
-      <w:r>
-        <w:t>Summary</w:t>
-      </w:r>
-      <w:bookmarkEnd w:id="17"/>
+      <w:bookmarkStart w:id="20" w:name="_Toc219895152"/>
+      <w:r>
+        <w:t>Analysis of Work Done</w:t>
+      </w:r>
+      <w:bookmarkEnd w:id="20"/>
     </w:p>
     <w:p/>
     <w:p>
       <w:pPr>
-        <w:ind w:left="360"/>
-      </w:pPr>
-      <w:r>
-        <w:t xml:space="preserve">Multiple Linear Regression is the best suitable AI approach for FPL points prediction, can be established by this research. </w:t>
-      </w:r>
-      <w:r>
-        <w:t xml:space="preserve"> This system is a Goal-Based Rational Agent, and was identified that Multiple Linear Regression, which is the best suitable algorithm for predicting a continuous point return of players. </w:t>
+        <w:ind w:left="360" w:firstLine="360"/>
+      </w:pPr>
+      <w:r>
+        <w:t xml:space="preserve">The </w:t>
+      </w:r>
+      <w:r>
+        <w:t xml:space="preserve">project successfully was able to </w:t>
+      </w:r>
+      <w:proofErr w:type="gramStart"/>
+      <w:r>
+        <w:t>met</w:t>
+      </w:r>
+      <w:proofErr w:type="gramEnd"/>
+      <w:r>
+        <w:t xml:space="preserve"> the primary aim of the creating an objective prediction tool. Transitioning </w:t>
+      </w:r>
+      <w:proofErr w:type="gramStart"/>
+      <w:r>
+        <w:t>form</w:t>
+      </w:r>
+      <w:proofErr w:type="gramEnd"/>
+      <w:r>
+        <w:t xml:space="preserve"> the pure Linear Regression model to a Hybrid Architecture which was the critical success factor. The Linear Regression only model did not factor the complex tactical nature of football, </w:t>
+      </w:r>
+      <w:proofErr w:type="gramStart"/>
+      <w:r>
+        <w:t>Like</w:t>
+      </w:r>
+      <w:proofErr w:type="gramEnd"/>
+      <w:r>
+        <w:t xml:space="preserve"> even if a player is 100% </w:t>
+      </w:r>
+      <w:proofErr w:type="gramStart"/>
+      <w:r>
+        <w:t>fit</w:t>
+      </w:r>
+      <w:proofErr w:type="gramEnd"/>
+      <w:r>
+        <w:t xml:space="preserve"> they might not be playing, they might not start the game, they might be on the bench. By using the Expert’s Rules on top of the AI, the smart was able to achieve a balance between statistical power and tactical reality. </w:t>
+      </w:r>
+    </w:p>
+    <w:p/>
+    <w:p>
+      <w:pPr>
+        <w:pStyle w:val="Heading2"/>
+        <w:numPr>
+          <w:ilvl w:val="1"/>
+          <w:numId w:val="1"/>
+        </w:numPr>
+      </w:pPr>
+      <w:bookmarkStart w:id="21" w:name="_Toc219895153"/>
+      <w:r>
+        <w:t>Real World Application</w:t>
+      </w:r>
+      <w:bookmarkEnd w:id="21"/>
+      <w:r>
+        <w:t xml:space="preserve"> </w:t>
+      </w:r>
+    </w:p>
+    <w:p/>
+    <w:p>
+      <w:pPr>
+        <w:ind w:left="360" w:firstLine="360"/>
+      </w:pPr>
+      <w:r>
+        <w:t xml:space="preserve">Addressing the Cognitive Bias problem. And can be used on other systems </w:t>
+      </w:r>
+      <w:proofErr w:type="gramStart"/>
+      <w:r>
+        <w:t>not only football</w:t>
+      </w:r>
+      <w:proofErr w:type="gramEnd"/>
+      <w:r>
+        <w:t xml:space="preserve"> only. This same architecture can also be applied to sales forecasting, risk scoring, or performance prediction in other domains.</w:t>
+      </w:r>
+      <w:r>
+        <w:t xml:space="preserve"> Although Fantasy Premier League data is used to train this AI system, its basic architecture—a Hybrid Intelligence System that combines statistical regression with rule-based domain constraints—directly reflects how artificial intelligence is used in crucial enterprise industries:</w:t>
+      </w:r>
+      <w:r>
+        <w:t xml:space="preserve"> </w:t>
       </w:r>
     </w:p>
     <w:p>
@@ -4925,20 +6511,52 @@
           <w:ilvl w:val="0"/>
           <w:numId w:val="3"/>
         </w:numPr>
-      </w:pPr>
-      <w:r>
         <w:rPr>
           <w:b/>
           <w:bCs/>
         </w:rPr>
-        <w:t>Data Harmonization</w:t>
-      </w:r>
-      <w:r>
-        <w:t xml:space="preserve">: </w:t>
-      </w:r>
-      <w:r>
-        <w:t xml:space="preserve">The Intersection Merge strategy successfully unified the 5 years of historical data, after overcoming the significant discrepancy between the old and the new datasets. </w:t>
-      </w:r>
+      </w:pPr>
+      <w:r>
+        <w:rPr>
+          <w:b/>
+          <w:bCs/>
+        </w:rPr>
+        <w:lastRenderedPageBreak/>
+        <w:t xml:space="preserve">Sales </w:t>
+      </w:r>
+      <w:r>
+        <w:rPr>
+          <w:b/>
+          <w:bCs/>
+        </w:rPr>
+        <w:t xml:space="preserve">&amp; Demand </w:t>
+      </w:r>
+      <w:r>
+        <w:rPr>
+          <w:b/>
+          <w:bCs/>
+        </w:rPr>
+        <w:t xml:space="preserve">Forecasting: </w:t>
+      </w:r>
+      <w:r>
+        <w:t>In supply chain management and retail, abrupt market disruptions or extreme weather occurrences are frequently overlooked by pure statistical regression models. Like how our FPL model uses a "Big Club Tax" and a "Fixture Difficulty Multiplier" to modify raw statistical point forecasts, retail AI systems overlay business heuristic rules on past rolling sales averages to avoid stockouts or overstocking in erratic market conditions.</w:t>
+      </w:r>
+      <w:r>
+        <w:rPr>
+          <w:b/>
+          <w:bCs/>
+        </w:rPr>
+        <w:t xml:space="preserve">  </w:t>
+      </w:r>
+    </w:p>
+    <w:p>
+      <w:pPr>
+        <w:pStyle w:val="ListParagraph"/>
+        <w:rPr>
+          <w:b/>
+          <w:bCs/>
+        </w:rPr>
+      </w:pPr>
     </w:p>
     <w:p>
       <w:pPr>
@@ -4947,28 +6565,93 @@
           <w:ilvl w:val="0"/>
           <w:numId w:val="3"/>
         </w:numPr>
-      </w:pPr>
-      <w:r>
         <w:rPr>
           <w:b/>
           <w:bCs/>
         </w:rPr>
-        <w:t>Temporal Feature Engineering</w:t>
-      </w:r>
-      <w:r>
-        <w:t xml:space="preserve">: </w:t>
-      </w:r>
-      <w:r>
-        <w:t xml:space="preserve">The Player Form feature proved to be a strong predictor. </w:t>
-      </w:r>
-      <w:r>
-        <w:t xml:space="preserve">To Justify the use of a regression model, the correlation heatmap validated that recent form has a linear relation to the points </w:t>
-      </w:r>
-      <w:r>
-        <w:t>obtained.</w:t>
-      </w:r>
-    </w:p>
-    <w:p/>
+      </w:pPr>
+      <w:r>
+        <w:rPr>
+          <w:b/>
+          <w:bCs/>
+        </w:rPr>
+        <w:t>Financial</w:t>
+      </w:r>
+      <w:r>
+        <w:rPr>
+          <w:b/>
+          <w:bCs/>
+        </w:rPr>
+        <w:t xml:space="preserve"> </w:t>
+      </w:r>
+      <w:r>
+        <w:rPr>
+          <w:b/>
+          <w:bCs/>
+        </w:rPr>
+        <w:t>Risk Scoring:</w:t>
+      </w:r>
+      <w:r>
+        <w:rPr>
+          <w:b/>
+          <w:bCs/>
+        </w:rPr>
+        <w:t xml:space="preserve"> </w:t>
+      </w:r>
+      <w:r>
+        <w:t>Similar two-stage pipelines are used by banks and credit organizations to assess loan eligibility.</w:t>
+      </w:r>
+      <w:r>
+        <w:t xml:space="preserve"> </w:t>
+      </w:r>
+      <w:r>
+        <w:t>Strict, rule-based regulatory "circuit breakers" (like our starter probability thresholds) override the AI to automatically reject applicants who fall below mandatory compliance limits, regardless of their raw statistical score. A foundational machine learning model determines an applicant's continuous creditworthiness score based on historical transaction form.</w:t>
+      </w:r>
+    </w:p>
+    <w:p>
+      <w:pPr>
+        <w:pStyle w:val="ListParagraph"/>
+        <w:rPr>
+          <w:b/>
+          <w:bCs/>
+        </w:rPr>
+      </w:pPr>
+    </w:p>
+    <w:p>
+      <w:pPr>
+        <w:pStyle w:val="ListParagraph"/>
+        <w:rPr>
+          <w:b/>
+          <w:bCs/>
+        </w:rPr>
+      </w:pPr>
+    </w:p>
+    <w:p>
+      <w:pPr>
+        <w:rPr>
+          <w:b/>
+          <w:bCs/>
+        </w:rPr>
+      </w:pPr>
+      <w:r>
+        <w:rPr>
+          <w:b/>
+          <w:bCs/>
+        </w:rPr>
+        <w:t xml:space="preserve">Healthcare Triage &amp; Resource Allocation: </w:t>
+      </w:r>
+      <w:r>
+        <w:t>Hospital bed triage is intimately correlated with player availability and point returns. Hospital AI algorithms classify patients into priority tiers based on both continuous patient vital signs and discrete risk criteria (such as age or unexpected injury). The mathematical reasoning behind our step-curve starter probability heuristic, which lowers predicted points for players averaging less than 45 minutes, is identical to that used to de-escalate lower-risk patients from intensive care units.</w:t>
+      </w:r>
+    </w:p>
+    <w:p>
+      <w:pPr>
+        <w:rPr>
+          <w:b/>
+          <w:bCs/>
+        </w:rPr>
+      </w:pPr>
+    </w:p>
     <w:p>
       <w:pPr>
         <w:pStyle w:val="Heading2"/>
@@ -4977,13 +6660,24 @@
           <w:numId w:val="1"/>
         </w:numPr>
       </w:pPr>
-      <w:bookmarkStart w:id="18" w:name="_Toc216889948"/>
-      <w:r>
-        <w:t>Limitations</w:t>
-      </w:r>
-      <w:bookmarkEnd w:id="18"/>
+      <w:bookmarkStart w:id="22" w:name="_Toc219895154"/>
+      <w:r>
+        <w:t>Further Work</w:t>
+      </w:r>
+      <w:bookmarkEnd w:id="22"/>
+      <w:r>
+        <w:t xml:space="preserve"> </w:t>
+      </w:r>
     </w:p>
     <w:p/>
+    <w:p>
+      <w:pPr>
+        <w:ind w:left="360"/>
+      </w:pPr>
+      <w:r>
+        <w:t>Further iterations to improve the prediction accuracy:</w:t>
+      </w:r>
+    </w:p>
     <w:p>
       <w:pPr>
         <w:pStyle w:val="ListParagraph"/>
@@ -4997,13 +6691,10 @@
           <w:b/>
           <w:bCs/>
         </w:rPr>
-        <w:t>External Factors</w:t>
-      </w:r>
-      <w:r>
-        <w:t>:</w:t>
-      </w:r>
-      <w:r>
-        <w:t xml:space="preserve"> Assuming the random Nature of Football, a player might have high xG but fail to score due to variance or luck.</w:t>
+        <w:t>Non-Linear Models</w:t>
+      </w:r>
+      <w:r>
+        <w:t>: Implement LST to capture sequential from trends compared to simple rolling averages.</w:t>
       </w:r>
     </w:p>
     <w:p>
@@ -5019,13 +6710,18 @@
           <w:b/>
           <w:bCs/>
         </w:rPr>
-        <w:t>Pep Roulette</w:t>
-      </w:r>
-      <w:r>
-        <w:t>:</w:t>
-      </w:r>
-      <w:r>
-        <w:t xml:space="preserve"> Because this model relies highly on Minutes Played as an input but cannot predict the sudden tactical changes. A manager can rotate key players of a team to give them rest for a more important game mid-week like a Champions League games, giving them 0 minutes, the model cannot access this data from the press conference news, which might incorrectly predict high points.</w:t>
+        <w:t>Fixture Congestion Analysis</w:t>
+      </w:r>
+      <w:r>
+        <w:t xml:space="preserve">: Players </w:t>
+      </w:r>
+      <w:proofErr w:type="gramStart"/>
+      <w:r>
+        <w:t>have to</w:t>
+      </w:r>
+      <w:proofErr w:type="gramEnd"/>
+      <w:r>
+        <w:t xml:space="preserve"> play in multiple competitions which are cramped short period of time, so integrating rest days feature to improve rotation prediction.</w:t>
       </w:r>
     </w:p>
     <w:p>
@@ -5041,50 +6737,14 @@
           <w:b/>
           <w:bCs/>
         </w:rPr>
-        <w:t>Linear Assumption</w:t>
-      </w:r>
-      <w:r>
-        <w:t xml:space="preserve">: Linear regression </w:t>
-      </w:r>
-      <w:r>
-        <w:t xml:space="preserve">assumes a straight-lines relationship. But a player’s performance can be non-linear, </w:t>
-      </w:r>
-      <w:proofErr w:type="spellStart"/>
-      <w:proofErr w:type="gramStart"/>
-      <w:r>
-        <w:t>a</w:t>
-      </w:r>
-      <w:proofErr w:type="spellEnd"/>
-      <w:proofErr w:type="gramEnd"/>
-      <w:r>
-        <w:t xml:space="preserve"> injury, a mistake, some sort of sickness, household trouble, may be some unknown factor.</w:t>
-      </w:r>
-    </w:p>
-    <w:p/>
-    <w:p>
-      <w:pPr>
-        <w:pStyle w:val="Heading2"/>
-        <w:numPr>
-          <w:ilvl w:val="1"/>
-          <w:numId w:val="1"/>
-        </w:numPr>
-      </w:pPr>
-      <w:bookmarkStart w:id="19" w:name="_Toc216889949"/>
-      <w:r>
-        <w:t>Future Work (Milestone 2)</w:t>
-      </w:r>
-      <w:bookmarkEnd w:id="19"/>
-    </w:p>
-    <w:p>
-      <w:pPr>
-        <w:spacing w:line="240" w:lineRule="auto"/>
-        <w:jc w:val="left"/>
-        <w:rPr>
-          <w:iCs/>
-          <w:sz w:val="20"/>
-          <w:szCs w:val="20"/>
-        </w:rPr>
-      </w:pPr>
+        <w:t>Sentiment Analysis</w:t>
+      </w:r>
+      <w:r>
+        <w:t xml:space="preserve">: </w:t>
+      </w:r>
+      <w:r>
+        <w:t>Using NLP to get the injury news from the press conferences, not in the official API.</w:t>
+      </w:r>
     </w:p>
     <w:p>
       <w:pPr>
@@ -5094,39 +6754,27 @@
           <w:numId w:val="3"/>
         </w:numPr>
       </w:pPr>
+      <w:proofErr w:type="spellStart"/>
       <w:r>
         <w:rPr>
           <w:b/>
           <w:bCs/>
         </w:rPr>
-        <w:t>Train</w:t>
-      </w:r>
-      <w:r>
-        <w:t>: Use Scikit-Learn to calculate the optimal coefficient (</w:t>
-      </w:r>
-      <w:r>
-        <w:rPr>
-          <w:rFonts w:cs="Times New Roman"/>
-        </w:rPr>
-        <w:t>β</w:t>
-      </w:r>
-      <w:r>
-        <w:t>) for the regression equation.</w:t>
-      </w:r>
-    </w:p>
-    <w:p>
-      <w:pPr>
-        <w:pStyle w:val="ListParagraph"/>
-        <w:numPr>
-          <w:ilvl w:val="0"/>
-          <w:numId w:val="3"/>
-        </w:numPr>
-      </w:pPr>
-      <w:r>
-        <w:t>Implement</w:t>
-      </w:r>
-      <w:r>
-        <w:t xml:space="preserve"> the Live Prediction script to fetch the latest Game week data from the Api and predict points for the future game weeks.</w:t>
+        <w:t>Backtest</w:t>
+      </w:r>
+      <w:proofErr w:type="spellEnd"/>
+      <w:r>
+        <w:rPr>
+          <w:b/>
+          <w:bCs/>
+        </w:rPr>
+        <w:t xml:space="preserve"> Refinement</w:t>
+      </w:r>
+      <w:r>
+        <w:t>:</w:t>
+      </w:r>
+      <w:r>
+        <w:t xml:space="preserve"> implement a robust historical injury database would allow for perfect historical simulation. </w:t>
       </w:r>
     </w:p>
     <w:p>
@@ -5140,23 +6788,21 @@
         </w:rPr>
       </w:pPr>
     </w:p>
-    <w:bookmarkStart w:id="20" w:name="_Toc216889950" w:displacedByCustomXml="next"/>
+    <w:bookmarkStart w:id="23" w:name="_Toc219895155" w:displacedByCustomXml="next"/>
     <w:sdt>
       <w:sdtPr>
+        <w:rPr>
+          <w:b w:val="0"/>
+          <w:color w:val="auto"/>
+          <w:sz w:val="24"/>
+          <w:szCs w:val="24"/>
+        </w:rPr>
         <w:id w:val="1704437608"/>
         <w:docPartObj>
           <w:docPartGallery w:val="Bibliographies"/>
           <w:docPartUnique/>
         </w:docPartObj>
       </w:sdtPr>
-      <w:sdtEndPr>
-        <w:rPr>
-          <w:b w:val="0"/>
-          <w:color w:val="auto"/>
-          <w:sz w:val="24"/>
-          <w:szCs w:val="24"/>
-        </w:rPr>
-      </w:sdtEndPr>
       <w:sdtContent>
         <w:p>
           <w:pPr>
@@ -5165,7 +6811,7 @@
           <w:r>
             <w:t>Bibliography</w:t>
           </w:r>
-          <w:bookmarkEnd w:id="20"/>
+          <w:bookmarkEnd w:id="23"/>
         </w:p>
         <w:sdt>
           <w:sdtPr>
@@ -5223,6 +6869,7 @@
                 <w:rPr>
                   <w:noProof/>
                 </w:rPr>
+                <w:lastRenderedPageBreak/>
                 <w:t xml:space="preserve">Gareth James • Daniela Witten • Trevor Hastie. (2023). </w:t>
               </w:r>
               <w:r>
@@ -5238,36 +6885,6 @@
                   <w:noProof/>
                 </w:rPr>
                 <w:t xml:space="preserve"> </w:t>
-              </w:r>
-            </w:p>
-            <w:p>
-              <w:pPr>
-                <w:pStyle w:val="Bibliography"/>
-                <w:ind w:left="720" w:hanging="720"/>
-                <w:rPr>
-                  <w:noProof/>
-                </w:rPr>
-              </w:pPr>
-              <w:r>
-                <w:rPr>
-                  <w:noProof/>
-                </w:rPr>
-                <w:t>Lecture. (n.d.).</w:t>
-              </w:r>
-            </w:p>
-            <w:p>
-              <w:pPr>
-                <w:pStyle w:val="Bibliography"/>
-                <w:ind w:left="720" w:hanging="720"/>
-                <w:rPr>
-                  <w:noProof/>
-                </w:rPr>
-              </w:pPr>
-              <w:r>
-                <w:rPr>
-                  <w:noProof/>
-                </w:rPr>
-                <w:t>Lecture, w. 5. (n.d.).</w:t>
               </w:r>
             </w:p>
             <w:p>
@@ -5339,9 +6956,9 @@
       </w:pPr>
     </w:p>
     <w:sectPr>
-      <w:headerReference w:type="default" r:id="rId13"/>
-      <w:footerReference w:type="default" r:id="rId14"/>
-      <w:footerReference w:type="first" r:id="rId15"/>
+      <w:headerReference w:type="default" r:id="rId14"/>
+      <w:footerReference w:type="default" r:id="rId15"/>
+      <w:footerReference w:type="first" r:id="rId16"/>
       <w:pgSz w:w="12240" w:h="15840"/>
       <w:pgMar w:top="1440" w:right="1440" w:bottom="1440" w:left="1440" w:header="720" w:footer="720" w:gutter="0"/>
       <w:pgNumType w:start="1"/>
@@ -5631,6 +7248,95 @@
     </w:lvl>
   </w:abstractNum>
   <w:abstractNum w:abstractNumId="1" w15:restartNumberingAfterBreak="0">
+    <w:nsid w:val="29FA17E1"/>
+    <w:multiLevelType w:val="hybridMultilevel"/>
+    <w:tmpl w:val="14EC1626"/>
+    <w:lvl w:ilvl="0" w:tplc="04090019">
+      <w:start w:val="1"/>
+      <w:numFmt w:val="lowerLetter"/>
+      <w:lvlText w:val="%1."/>
+      <w:lvlJc w:val="left"/>
+      <w:pPr>
+        <w:ind w:left="720" w:hanging="360"/>
+      </w:pPr>
+      <w:rPr>
+        <w:rFonts w:hint="default"/>
+      </w:rPr>
+    </w:lvl>
+    <w:lvl w:ilvl="1" w:tplc="04090019">
+      <w:start w:val="1"/>
+      <w:numFmt w:val="lowerLetter"/>
+      <w:lvlText w:val="%2."/>
+      <w:lvlJc w:val="left"/>
+      <w:pPr>
+        <w:ind w:left="1440" w:hanging="360"/>
+      </w:pPr>
+    </w:lvl>
+    <w:lvl w:ilvl="2" w:tplc="0409001B" w:tentative="1">
+      <w:start w:val="1"/>
+      <w:numFmt w:val="lowerRoman"/>
+      <w:lvlText w:val="%3."/>
+      <w:lvlJc w:val="right"/>
+      <w:pPr>
+        <w:ind w:left="2160" w:hanging="180"/>
+      </w:pPr>
+    </w:lvl>
+    <w:lvl w:ilvl="3" w:tplc="0409000F" w:tentative="1">
+      <w:start w:val="1"/>
+      <w:numFmt w:val="decimal"/>
+      <w:lvlText w:val="%4."/>
+      <w:lvlJc w:val="left"/>
+      <w:pPr>
+        <w:ind w:left="2880" w:hanging="360"/>
+      </w:pPr>
+    </w:lvl>
+    <w:lvl w:ilvl="4" w:tplc="04090019" w:tentative="1">
+      <w:start w:val="1"/>
+      <w:numFmt w:val="lowerLetter"/>
+      <w:lvlText w:val="%5."/>
+      <w:lvlJc w:val="left"/>
+      <w:pPr>
+        <w:ind w:left="3600" w:hanging="360"/>
+      </w:pPr>
+    </w:lvl>
+    <w:lvl w:ilvl="5" w:tplc="0409001B" w:tentative="1">
+      <w:start w:val="1"/>
+      <w:numFmt w:val="lowerRoman"/>
+      <w:lvlText w:val="%6."/>
+      <w:lvlJc w:val="right"/>
+      <w:pPr>
+        <w:ind w:left="4320" w:hanging="180"/>
+      </w:pPr>
+    </w:lvl>
+    <w:lvl w:ilvl="6" w:tplc="0409000F" w:tentative="1">
+      <w:start w:val="1"/>
+      <w:numFmt w:val="decimal"/>
+      <w:lvlText w:val="%7."/>
+      <w:lvlJc w:val="left"/>
+      <w:pPr>
+        <w:ind w:left="5040" w:hanging="360"/>
+      </w:pPr>
+    </w:lvl>
+    <w:lvl w:ilvl="7" w:tplc="04090019" w:tentative="1">
+      <w:start w:val="1"/>
+      <w:numFmt w:val="lowerLetter"/>
+      <w:lvlText w:val="%8."/>
+      <w:lvlJc w:val="left"/>
+      <w:pPr>
+        <w:ind w:left="5760" w:hanging="360"/>
+      </w:pPr>
+    </w:lvl>
+    <w:lvl w:ilvl="8" w:tplc="0409001B" w:tentative="1">
+      <w:start w:val="1"/>
+      <w:numFmt w:val="lowerRoman"/>
+      <w:lvlText w:val="%9."/>
+      <w:lvlJc w:val="right"/>
+      <w:pPr>
+        <w:ind w:left="6480" w:hanging="180"/>
+      </w:pPr>
+    </w:lvl>
+  </w:abstractNum>
+  <w:abstractNum w:abstractNumId="2" w15:restartNumberingAfterBreak="0">
     <w:nsid w:val="32EB2E1F"/>
     <w:multiLevelType w:val="hybridMultilevel"/>
     <w:tmpl w:val="48E4C536"/>
@@ -5743,7 +7449,7 @@
       </w:rPr>
     </w:lvl>
   </w:abstractNum>
-  <w:abstractNum w:abstractNumId="2" w15:restartNumberingAfterBreak="0">
+  <w:abstractNum w:abstractNumId="3" w15:restartNumberingAfterBreak="0">
     <w:nsid w:val="3EAF7798"/>
     <w:multiLevelType w:val="hybridMultilevel"/>
     <w:tmpl w:val="BCBAAC16"/>
@@ -5855,7 +7561,7 @@
       </w:rPr>
     </w:lvl>
   </w:abstractNum>
-  <w:abstractNum w:abstractNumId="3" w15:restartNumberingAfterBreak="0">
+  <w:abstractNum w:abstractNumId="4" w15:restartNumberingAfterBreak="0">
     <w:nsid w:val="64C0623D"/>
     <w:multiLevelType w:val="hybridMultilevel"/>
     <w:tmpl w:val="F8683854"/>
@@ -5948,13 +7654,16 @@
     <w:abstractNumId w:val="0"/>
   </w:num>
   <w:num w:numId="2" w16cid:durableId="1726492029">
+    <w:abstractNumId w:val="4"/>
+  </w:num>
+  <w:num w:numId="3" w16cid:durableId="805391822">
+    <w:abstractNumId w:val="2"/>
+  </w:num>
+  <w:num w:numId="4" w16cid:durableId="1128474086">
     <w:abstractNumId w:val="3"/>
   </w:num>
-  <w:num w:numId="3" w16cid:durableId="805391822">
+  <w:num w:numId="5" w16cid:durableId="1146119491">
     <w:abstractNumId w:val="1"/>
-  </w:num>
-  <w:num w:numId="4" w16cid:durableId="1128474086">
-    <w:abstractNumId w:val="2"/>
   </w:num>
 </w:numbering>
 </file>
@@ -6357,7 +8066,7 @@
   <w:style w:type="paragraph" w:default="1" w:styleId="Normal">
     <w:name w:val="Normal"/>
     <w:qFormat/>
-    <w:rsid w:val="003F5971"/>
+    <w:rsid w:val="00205E8B"/>
     <w:pPr>
       <w:jc w:val="both"/>
     </w:pPr>
@@ -6490,6 +8199,7 @@
   <w:style w:type="character" w:default="1" w:styleId="DefaultParagraphFont">
     <w:name w:val="Default Paragraph Font"/>
     <w:uiPriority w:val="1"/>
+    <w:semiHidden/>
     <w:unhideWhenUsed/>
   </w:style>
   <w:style w:type="table" w:default="1" w:styleId="TableNormal">
@@ -7070,7 +8780,6 @@
     <w:sig w:usb0="E4002EFF" w:usb1="C200247B" w:usb2="00000009" w:usb3="00000000" w:csb0="000001FF" w:csb1="00000000"/>
   </w:font>
   <w:font w:name="MS Mincho">
-    <w:altName w:val="ＭＳ 明朝"/>
     <w:panose1 w:val="02020609040205080304"/>
     <w:charset w:val="80"/>
     <w:family w:val="modern"/>
@@ -7099,7 +8808,6 @@
     <w:sig w:usb0="20000287" w:usb1="00000003" w:usb2="00000000" w:usb3="00000000" w:csb0="0000019F" w:csb1="00000000"/>
   </w:font>
   <w:font w:name="Yu Mincho">
-    <w:altName w:val="游明朝"/>
     <w:charset w:val="80"/>
     <w:family w:val="roman"/>
     <w:pitch w:val="variable"/>
@@ -7139,21 +8847,30 @@
   <w:rsids>
     <w:rsidRoot w:val="009C564A"/>
     <w:rsid w:val="00021C19"/>
+    <w:rsid w:val="00075149"/>
     <w:rsid w:val="00104023"/>
     <w:rsid w:val="00305AD1"/>
     <w:rsid w:val="0033076C"/>
     <w:rsid w:val="00331559"/>
+    <w:rsid w:val="003A27D9"/>
+    <w:rsid w:val="003D4C7F"/>
+    <w:rsid w:val="00423C84"/>
+    <w:rsid w:val="004E1F48"/>
     <w:rsid w:val="00532D6C"/>
     <w:rsid w:val="00561611"/>
     <w:rsid w:val="005964DA"/>
     <w:rsid w:val="005E2B1F"/>
     <w:rsid w:val="006941BE"/>
     <w:rsid w:val="00746582"/>
+    <w:rsid w:val="008022B5"/>
     <w:rsid w:val="0089543D"/>
+    <w:rsid w:val="008E0E38"/>
     <w:rsid w:val="008F0A7A"/>
     <w:rsid w:val="009C564A"/>
+    <w:rsid w:val="00A33752"/>
     <w:rsid w:val="00A7585F"/>
     <w:rsid w:val="00B36377"/>
+    <w:rsid w:val="00D935A5"/>
     <w:rsid w:val="00E65968"/>
     <w:rsid w:val="00F264C3"/>
     <w:rsid w:val="00F268E6"/>
@@ -7612,7 +9329,7 @@
     <w:basedOn w:val="DefaultParagraphFont"/>
     <w:uiPriority w:val="99"/>
     <w:semiHidden/>
-    <w:rsid w:val="00532D6C"/>
+    <w:rsid w:val="00D935A5"/>
     <w:rPr>
       <w:color w:val="808080"/>
     </w:rPr>

</xml_diff>